<commit_message>
Refine explanation of name deception and its impact
Update the 'A Note on the Name' section to more accurately reflect the manuscript's message regarding the deception of the name "Jesus," emphasizing frequency, potential misdirection of prayers, and its alignment with the book's core themes.

Replit-Commit-Author: Agent
Replit-Commit-Session-Id: 715fc2d1-ade6-462c-82fe-64cd42a1fd4f
Replit-Commit-Checkpoint-Type: full_checkpoint
Replit-Commit-Event-Id: b9903fd1-343b-488c-8677-138aeb0632f8
Replit-Commit-Screenshot-Url: https://storage.googleapis.com/screenshot-production-us-central1/605f8aff-5e91-4581-9509-5e471a311930/715fc2d1-ade6-462c-82fe-64cd42a1fd4f/L5B2Yz3
Replit-Helium-Checkpoint-Created: true
</commit_message>
<xml_diff>
--- a/attached_assets/Through-The-Veil-KINDLE.docx
+++ b/attached_assets/Through-The-Veil-KINDLE.docx
@@ -347,15 +347,23 @@
         <w:pStyle w:val="BodyText"/>
       </w:pPr>
       <w:r>
-        <w:t xml:space="preserve">Please understand what is being said - and what is not.</w:t>
-      </w:r>
-    </w:p>
-    <w:p>
-      <w:pPr>
-        <w:pStyle w:val="BodyText"/>
-      </w:pPr>
-      <w:r>
-        <w:t xml:space="preserve">This book does not deny the Messiah. This book honors him by seeking his actual name.</w:t>
+        <w:t xml:space="preserve">This book does not deny the Messiah. This book exposes</w:t>
+      </w:r>
+      <w:r>
+        <w:t xml:space="preserve"> </w:t>
+      </w:r>
+      <w:r>
+        <w:rPr>
+          <w:b/>
+          <w:bCs/>
+        </w:rPr>
+        <w:t xml:space="preserve">a deception</w:t>
+      </w:r>
+      <w:r>
+        <w:t xml:space="preserve"> </w:t>
+      </w:r>
+      <w:r>
+        <w:t xml:space="preserve">that has been operating for centuries.</w:t>
       </w:r>
     </w:p>
     <w:p>
@@ -435,7 +443,7 @@
         <w:t xml:space="preserve"> </w:t>
       </w:r>
       <w:r>
-        <w:t xml:space="preserve">- a Hebrew name meaning</w:t>
+        <w:t xml:space="preserve">- meaning</w:t>
       </w:r>
       <w:r>
         <w:t xml:space="preserve"> </w:t>
@@ -453,15 +461,25 @@
         <w:t xml:space="preserve"> </w:t>
       </w:r>
       <w:r>
-        <w:t xml:space="preserve">The Father’s name is embedded in the Son’s name. That connection was intentional. That connection was severed when the name was changed.</w:t>
-      </w:r>
-    </w:p>
-    <w:p>
-      <w:pPr>
-        <w:pStyle w:val="BodyText"/>
-      </w:pPr>
-      <w:r>
-        <w:t xml:space="preserve">The Father also has a name -</w:t>
+        <w:t xml:space="preserve">The Father’s name is embedded in the Son’s name. That connection was intentional.</w:t>
+      </w:r>
+      <w:r>
+        <w:t xml:space="preserve"> </w:t>
+      </w:r>
+      <w:r>
+        <w:rPr>
+          <w:b/>
+          <w:bCs/>
+        </w:rPr>
+        <w:t xml:space="preserve">That connection was severed when the name was changed.</w:t>
+      </w:r>
+    </w:p>
+    <w:p>
+      <w:pPr>
+        <w:pStyle w:val="BodyText"/>
+      </w:pPr>
+      <w:r>
+        <w:t xml:space="preserve">The Father’s name -</w:t>
       </w:r>
       <w:r>
         <w:t xml:space="preserve"> </w:t>
@@ -477,7 +495,7 @@
         <w:t xml:space="preserve"> </w:t>
       </w:r>
       <w:r>
-        <w:t xml:space="preserve">- which appears over 6,800 times in the Hebrew scriptures. It was replaced with</w:t>
+        <w:t xml:space="preserve">- appears over 6,800 times in the Hebrew scriptures. It was replaced with</w:t>
       </w:r>
       <w:r>
         <w:t xml:space="preserve"> </w:t>
@@ -495,113 +513,95 @@
         <w:t xml:space="preserve"> </w:t>
       </w:r>
       <w:r>
-        <w:t xml:space="preserve">in English translations. Not translated. Replaced.</w:t>
-      </w:r>
-    </w:p>
-    <w:p>
-      <w:pPr>
-        <w:pStyle w:val="BodyText"/>
-      </w:pPr>
-      <w:r>
-        <w:t xml:space="preserve">This matters. The Messiah himself said:</w:t>
-      </w:r>
-      <w:r>
-        <w:t xml:space="preserve"> </w:t>
-      </w:r>
-      <w:r>
-        <w:rPr>
-          <w:i/>
-          <w:iCs/>
-        </w:rPr>
-        <w:t xml:space="preserve">“</w:t>
-      </w:r>
-      <w:r>
-        <w:rPr>
-          <w:i/>
-          <w:iCs/>
-        </w:rPr>
-        <w:t xml:space="preserve">If you love me, keep my commandments.</w:t>
-      </w:r>
-      <w:r>
-        <w:rPr>
-          <w:i/>
-          <w:iCs/>
-        </w:rPr>
-        <w:t xml:space="preserve">”</w:t>
-      </w:r>
-      <w:r>
-        <w:t xml:space="preserve"> </w:t>
-      </w:r>
-      <w:r>
-        <w:t xml:space="preserve">One of those commandments:</w:t>
-      </w:r>
-      <w:r>
-        <w:t xml:space="preserve"> </w:t>
-      </w:r>
-      <w:r>
-        <w:rPr>
-          <w:i/>
-          <w:iCs/>
-        </w:rPr>
-        <w:t xml:space="preserve">“</w:t>
-      </w:r>
-      <w:r>
-        <w:rPr>
-          <w:i/>
-          <w:iCs/>
-        </w:rPr>
-        <w:t xml:space="preserve">You shall not take the name of Yahuah your Elohiym in vain.</w:t>
-      </w:r>
-      <w:r>
-        <w:rPr>
-          <w:i/>
-          <w:iCs/>
-        </w:rPr>
-        <w:t xml:space="preserve">”</w:t>
-      </w:r>
-      <w:r>
-        <w:t xml:space="preserve"> </w:t>
-      </w:r>
-      <w:r>
-        <w:t xml:space="preserve">Another:</w:t>
-      </w:r>
-      <w:r>
-        <w:t xml:space="preserve"> </w:t>
-      </w:r>
-      <w:r>
-        <w:rPr>
-          <w:i/>
-          <w:iCs/>
-        </w:rPr>
-        <w:t xml:space="preserve">“</w:t>
-      </w:r>
-      <w:r>
-        <w:rPr>
-          <w:i/>
-          <w:iCs/>
-        </w:rPr>
-        <w:t xml:space="preserve">This is my name forever, and this is my memorial unto all generations.</w:t>
-      </w:r>
-      <w:r>
-        <w:rPr>
-          <w:i/>
-          <w:iCs/>
-        </w:rPr>
-        <w:t xml:space="preserve">”</w:t>
-      </w:r>
-    </w:p>
-    <w:p>
-      <w:pPr>
-        <w:pStyle w:val="BodyText"/>
-      </w:pPr>
-      <w:r>
-        <w:t xml:space="preserve">He asked to be called by his name. Not a made-up name. Not a Greek-Latin-English transformation that sounds nothing like the original. His actual name - the frequency produced when that name is spoken aloud.</w:t>
-      </w:r>
-    </w:p>
-    <w:p>
-      <w:pPr>
-        <w:pStyle w:val="BodyText"/>
-      </w:pPr>
+        <w:t xml:space="preserve">in English translations. Not translated.</w:t>
+      </w:r>
+      <w:r>
+        <w:t xml:space="preserve"> </w:t>
+      </w:r>
+      <w:r>
+        <w:rPr>
+          <w:b/>
+          <w:bCs/>
+        </w:rPr>
+        <w:t xml:space="preserve">Replaced.</w:t>
+      </w:r>
+      <w:r>
+        <w:t xml:space="preserve"> </w:t>
+      </w:r>
+      <w:r>
+        <w:t xml:space="preserve">The name was targeted because the name carries power. The name carries identity. The name carries covenant.</w:t>
+      </w:r>
+    </w:p>
+    <w:p>
+      <w:pPr>
+        <w:pStyle w:val="BodyText"/>
+      </w:pPr>
+      <w:r>
+        <w:t xml:space="preserve">This is not about pronunciation preferences.</w:t>
+      </w:r>
+      <w:r>
+        <w:t xml:space="preserve"> </w:t>
+      </w:r>
+      <w:r>
+        <w:rPr>
+          <w:b/>
+          <w:bCs/>
+        </w:rPr>
+        <w:t xml:space="preserve">Everything is frequency. Everything is vibration.</w:t>
+      </w:r>
+    </w:p>
+    <w:p>
+      <w:pPr>
+        <w:pStyle w:val="BodyText"/>
+      </w:pPr>
+      <w:r>
+        <w:t xml:space="preserve">The name</w:t>
+      </w:r>
+      <w:r>
+        <w:t xml:space="preserve"> </w:t>
+      </w:r>
+      <w:r>
+        <w:rPr>
+          <w:b/>
+          <w:bCs/>
+        </w:rPr>
+        <w:t xml:space="preserve">Yahusha</w:t>
+      </w:r>
+      <w:r>
+        <w:t xml:space="preserve"> </w:t>
+      </w:r>
+      <w:r>
+        <w:t xml:space="preserve">contains the frequency signature of Yahuah -</w:t>
+      </w:r>
+      <w:r>
+        <w:t xml:space="preserve"> </w:t>
+      </w:r>
+      <w:r>
+        <w:t xml:space="preserve">“</w:t>
+      </w:r>
+      <w:r>
+        <w:t xml:space="preserve">Yahuah is salvation.</w:t>
+      </w:r>
+      <w:r>
+        <w:t xml:space="preserve">”</w:t>
+      </w:r>
+      <w:r>
+        <w:t xml:space="preserve"> </w:t>
+      </w:r>
+      <w:r>
+        <w:t xml:space="preserve">It connects to the Father. When spoken aloud, it produces a specific frequency.</w:t>
+      </w:r>
+    </w:p>
+    <w:p>
+      <w:pPr>
+        <w:pStyle w:val="BodyText"/>
+      </w:pPr>
+      <w:r>
+        <w:t xml:space="preserve">The name</w:t>
+      </w:r>
+      <w:r>
+        <w:t xml:space="preserve"> </w:t>
+      </w:r>
       <w:r>
         <w:t xml:space="preserve">“</w:t>
       </w:r>
@@ -615,7 +615,92 @@
         <w:t xml:space="preserve"> </w:t>
       </w:r>
       <w:r>
-        <w:t xml:space="preserve">is not a transliteration. A transliteration preserves the sounds. Compare:</w:t>
+        <w:t xml:space="preserve">has a</w:t>
+      </w:r>
+      <w:r>
+        <w:t xml:space="preserve"> </w:t>
+      </w:r>
+      <w:r>
+        <w:rPr>
+          <w:b/>
+          <w:bCs/>
+        </w:rPr>
+        <w:t xml:space="preserve">different frequency</w:t>
+      </w:r>
+      <w:r>
+        <w:t xml:space="preserve">. A different signature.</w:t>
+      </w:r>
+      <w:r>
+        <w:t xml:space="preserve"> </w:t>
+      </w:r>
+      <w:r>
+        <w:rPr>
+          <w:b/>
+          <w:bCs/>
+        </w:rPr>
+        <w:t xml:space="preserve">Potentially connecting to something else entirely.</w:t>
+      </w:r>
+    </w:p>
+    <w:p>
+      <w:pPr>
+        <w:pStyle w:val="BodyText"/>
+      </w:pPr>
+      <w:r>
+        <w:t xml:space="preserve">This is the deception that could fool even the elect. Not blatant evil. Not obvious darkness. But a name that sounds right, feels right, has been accepted for centuries -</w:t>
+      </w:r>
+      <w:r>
+        <w:t xml:space="preserve"> </w:t>
+      </w:r>
+      <w:r>
+        <w:rPr>
+          <w:b/>
+          <w:bCs/>
+        </w:rPr>
+        <w:t xml:space="preserve">yet connects to the wrong source.</w:t>
+      </w:r>
+    </w:p>
+    <w:p>
+      <w:pPr>
+        <w:pStyle w:val="BodyText"/>
+      </w:pPr>
+      <w:r>
+        <w:t xml:space="preserve">Think about what that means: Praying sincerely, with genuine heart, to a name that routes elsewhere.</w:t>
+      </w:r>
+      <w:r>
+        <w:t xml:space="preserve"> </w:t>
+      </w:r>
+      <w:r>
+        <w:rPr>
+          <w:b/>
+          <w:bCs/>
+        </w:rPr>
+        <w:t xml:space="preserve">Inviting something in</w:t>
+      </w:r>
+      <w:r>
+        <w:t xml:space="preserve"> </w:t>
+      </w:r>
+      <w:r>
+        <w:t xml:space="preserve">while believing you’re connecting to the Messiah.</w:t>
+      </w:r>
+    </w:p>
+    <w:p>
+      <w:pPr>
+        <w:pStyle w:val="BodyText"/>
+      </w:pPr>
+      <w:r>
+        <w:t xml:space="preserve">“</w:t>
+      </w:r>
+      <w:r>
+        <w:t xml:space="preserve">Jesus</w:t>
+      </w:r>
+      <w:r>
+        <w:t xml:space="preserve">”</w:t>
+      </w:r>
+      <w:r>
+        <w:t xml:space="preserve"> </w:t>
+      </w:r>
+      <w:r>
+        <w:t xml:space="preserve">is not a transliteration. A transliteration preserves the sounds:</w:t>
       </w:r>
       <w:r>
         <w:t xml:space="preserve"> </w:t>
@@ -643,22 +728,7 @@
         <w:t xml:space="preserve"> </w:t>
       </w:r>
       <w:r>
-        <w:t xml:space="preserve">- English</w:t>
-      </w:r>
-      <w:r>
-        <w:t xml:space="preserve"> </w:t>
-      </w:r>
-      <w:r>
-        <w:t xml:space="preserve">“</w:t>
-      </w:r>
-      <w:r>
-        <w:t xml:space="preserve">transliteration</w:t>
-      </w:r>
-      <w:r>
-        <w:t xml:space="preserve">”</w:t>
-      </w:r>
-      <w:r>
-        <w:t xml:space="preserve">:</w:t>
+        <w:t xml:space="preserve">- English:</w:t>
       </w:r>
       <w:r>
         <w:t xml:space="preserve"> </w:t>
@@ -684,23 +754,83 @@
         <w:pStyle w:val="BodyText"/>
       </w:pPr>
       <w:r>
-        <w:t xml:space="preserve">Those are not the same sounds. That is not transliteration. That is substitution.</w:t>
-      </w:r>
-    </w:p>
-    <w:p>
-      <w:pPr>
-        <w:pStyle w:val="BodyText"/>
-      </w:pPr>
-      <w:r>
-        <w:t xml:space="preserve">This book brings light to what was hidden. It restores glory to the deserving parties. It asks only that you consider: if the name matters - and scripture says it does - then shouldn’t we use the right one?</w:t>
-      </w:r>
-    </w:p>
-    <w:p>
-      <w:pPr>
-        <w:pStyle w:val="BodyText"/>
-      </w:pPr>
-      <w:r>
-        <w:t xml:space="preserve">Seeking the true name is not blasphemy. Accepting a substitute without question might be.</w:t>
+        <w:t xml:space="preserve">Those are not the same sounds. That is not transliteration.</w:t>
+      </w:r>
+      <w:r>
+        <w:t xml:space="preserve"> </w:t>
+      </w:r>
+      <w:r>
+        <w:rPr>
+          <w:b/>
+          <w:bCs/>
+        </w:rPr>
+        <w:t xml:space="preserve">That is substitution.</w:t>
+      </w:r>
+    </w:p>
+    <w:p>
+      <w:pPr>
+        <w:pStyle w:val="BodyText"/>
+      </w:pPr>
+      <w:r>
+        <w:t xml:space="preserve">This book brings light to what was hidden. Yes, it will cause heartburn. Yes, it threatens structures built on the deception. Yes, it upsets money-making schemes that depend on you never knowing.</w:t>
+      </w:r>
+    </w:p>
+    <w:p>
+      <w:pPr>
+        <w:pStyle w:val="BodyText"/>
+      </w:pPr>
+      <w:r>
+        <w:t xml:space="preserve">The glory must go to the deserved parties. The Messiah asked to be called by</w:t>
+      </w:r>
+      <w:r>
+        <w:t xml:space="preserve"> </w:t>
+      </w:r>
+      <w:r>
+        <w:rPr>
+          <w:b/>
+          <w:bCs/>
+        </w:rPr>
+        <w:t xml:space="preserve">his</w:t>
+      </w:r>
+      <w:r>
+        <w:t xml:space="preserve"> </w:t>
+      </w:r>
+      <w:r>
+        <w:t xml:space="preserve">name - not some other made-up name, not some Greek-Latin-English transformation.</w:t>
+      </w:r>
+      <w:r>
+        <w:t xml:space="preserve"> </w:t>
+      </w:r>
+      <w:r>
+        <w:rPr>
+          <w:b/>
+          <w:bCs/>
+        </w:rPr>
+        <w:t xml:space="preserve">His name.</w:t>
+      </w:r>
+      <w:r>
+        <w:t xml:space="preserve"> </w:t>
+      </w:r>
+      <w:r>
+        <w:t xml:space="preserve">The frequency that name produces when spoken aloud.</w:t>
+      </w:r>
+    </w:p>
+    <w:p>
+      <w:pPr>
+        <w:pStyle w:val="BodyText"/>
+      </w:pPr>
+      <w:r>
+        <w:t xml:space="preserve">Exposing deception is not blasphemy.</w:t>
+      </w:r>
+      <w:r>
+        <w:t xml:space="preserve"> </w:t>
+      </w:r>
+      <w:r>
+        <w:rPr>
+          <w:b/>
+          <w:bCs/>
+        </w:rPr>
+        <w:t xml:space="preserve">The deception is the blasphemy.</w:t>
       </w:r>
     </w:p>
     <w:p>

</xml_diff>

<commit_message>
Add scripture references to explain the importance of the divine name
Incorporate scriptural evidence from the Eth Cepher into the "A Note on the Name" section to support the assertion that the original Hebrew name holds divine power and significance.

Replit-Commit-Author: Agent
Replit-Commit-Session-Id: 715fc2d1-ade6-462c-82fe-64cd42a1fd4f
Replit-Commit-Checkpoint-Type: full_checkpoint
Replit-Commit-Event-Id: 6ffad962-b91c-4113-b877-9a468fc93b83
Replit-Commit-Screenshot-Url: https://storage.googleapis.com/screenshot-production-us-central1/605f8aff-5e91-4581-9509-5e471a311930/715fc2d1-ade6-462c-82fe-64cd42a1fd4f/L5B2Yz3
Replit-Helium-Checkpoint-Created: true
</commit_message>
<xml_diff>
--- a/attached_assets/Through-The-Veil-KINDLE.docx
+++ b/attached_assets/Through-The-Veil-KINDLE.docx
@@ -324,6 +324,18 @@
         <w:pStyle w:val="FirstParagraph"/>
       </w:pPr>
       <w:r>
+        <w:rPr>
+          <w:i/>
+          <w:iCs/>
+        </w:rPr>
+        <w:t xml:space="preserve">Scripture references from the Eth Cepher, which restores the Hebrew names</w:t>
+      </w:r>
+    </w:p>
+    <w:p>
+      <w:pPr>
+        <w:pStyle w:val="BodyText"/>
+      </w:pPr>
+      <w:r>
         <w:t xml:space="preserve">To those who believe this book blasphemes the Messiah by questioning the name</w:t>
       </w:r>
       <w:r>
@@ -535,6 +547,336 @@
     <w:p>
       <w:pPr>
         <w:pStyle w:val="BodyText"/>
+      </w:pPr>
+      <w:r>
+        <w:rPr>
+          <w:b/>
+          <w:bCs/>
+        </w:rPr>
+        <w:t xml:space="preserve">The scriptures themselves declare this:</w:t>
+      </w:r>
+    </w:p>
+    <w:p>
+      <w:pPr>
+        <w:pStyle w:val="BlockText"/>
+      </w:pPr>
+      <w:r>
+        <w:rPr>
+          <w:i/>
+          <w:iCs/>
+        </w:rPr>
+        <w:t xml:space="preserve">“</w:t>
+      </w:r>
+      <w:r>
+        <w:rPr>
+          <w:i/>
+          <w:iCs/>
+        </w:rPr>
+        <w:t xml:space="preserve">And Elohiym said moreover unto Mosheh, Thus shall you say unto the children of Yashar’el, Yahuah Elohiym of your fathers, the Elohiym of Avraham, the Elohiym of Yitschaq, and the Elohiym of Ya’aqov, has sent me unto you:</w:t>
+      </w:r>
+      <w:r>
+        <w:rPr>
+          <w:i/>
+          <w:iCs/>
+        </w:rPr>
+        <w:t xml:space="preserve"> </w:t>
+      </w:r>
+      <w:r>
+        <w:rPr>
+          <w:b/>
+          <w:bCs/>
+          <w:i/>
+          <w:iCs/>
+        </w:rPr>
+        <w:t xml:space="preserve">this is my name forever, and this is my memorial unto all generations.</w:t>
+      </w:r>
+      <w:r>
+        <w:rPr>
+          <w:i/>
+          <w:iCs/>
+        </w:rPr>
+        <w:t xml:space="preserve">”</w:t>
+      </w:r>
+      <w:r>
+        <w:t xml:space="preserve"> </w:t>
+      </w:r>
+      <w:r>
+        <w:t xml:space="preserve">—</w:t>
+      </w:r>
+      <w:r>
+        <w:t xml:space="preserve"> </w:t>
+      </w:r>
+      <w:r>
+        <w:rPr>
+          <w:b/>
+          <w:bCs/>
+        </w:rPr>
+        <w:t xml:space="preserve">Shemoth (Exodus) 3:15</w:t>
+      </w:r>
+    </w:p>
+    <w:p>
+      <w:pPr>
+        <w:pStyle w:val="BlockText"/>
+      </w:pPr>
+      <w:r>
+        <w:rPr>
+          <w:i/>
+          <w:iCs/>
+        </w:rPr>
+        <w:t xml:space="preserve">“</w:t>
+      </w:r>
+      <w:r>
+        <w:rPr>
+          <w:b/>
+          <w:bCs/>
+          <w:i/>
+          <w:iCs/>
+        </w:rPr>
+        <w:t xml:space="preserve">I am Yahuah: that is my name:</w:t>
+      </w:r>
+      <w:r>
+        <w:rPr>
+          <w:i/>
+          <w:iCs/>
+        </w:rPr>
+        <w:t xml:space="preserve"> </w:t>
+      </w:r>
+      <w:r>
+        <w:rPr>
+          <w:i/>
+          <w:iCs/>
+        </w:rPr>
+        <w:t xml:space="preserve">and my glory will I not give to another, neither my praise to graven images.</w:t>
+      </w:r>
+      <w:r>
+        <w:rPr>
+          <w:i/>
+          <w:iCs/>
+        </w:rPr>
+        <w:t xml:space="preserve">”</w:t>
+      </w:r>
+      <w:r>
+        <w:t xml:space="preserve"> </w:t>
+      </w:r>
+      <w:r>
+        <w:t xml:space="preserve">—</w:t>
+      </w:r>
+      <w:r>
+        <w:t xml:space="preserve"> </w:t>
+      </w:r>
+      <w:r>
+        <w:rPr>
+          <w:b/>
+          <w:bCs/>
+        </w:rPr>
+        <w:t xml:space="preserve">Yesha’yahu (Isaiah) 42:8</w:t>
+      </w:r>
+    </w:p>
+    <w:p>
+      <w:pPr>
+        <w:pStyle w:val="BlockText"/>
+      </w:pPr>
+      <w:r>
+        <w:rPr>
+          <w:i/>
+          <w:iCs/>
+        </w:rPr>
+        <w:t xml:space="preserve">“</w:t>
+      </w:r>
+      <w:r>
+        <w:rPr>
+          <w:i/>
+          <w:iCs/>
+        </w:rPr>
+        <w:t xml:space="preserve">Neither is there salvation in any other: for there is</w:t>
+      </w:r>
+      <w:r>
+        <w:rPr>
+          <w:i/>
+          <w:iCs/>
+        </w:rPr>
+        <w:t xml:space="preserve"> </w:t>
+      </w:r>
+      <w:r>
+        <w:rPr>
+          <w:b/>
+          <w:bCs/>
+          <w:i/>
+          <w:iCs/>
+        </w:rPr>
+        <w:t xml:space="preserve">no other name</w:t>
+      </w:r>
+      <w:r>
+        <w:rPr>
+          <w:i/>
+          <w:iCs/>
+        </w:rPr>
+        <w:t xml:space="preserve"> </w:t>
+      </w:r>
+      <w:r>
+        <w:rPr>
+          <w:i/>
+          <w:iCs/>
+        </w:rPr>
+        <w:t xml:space="preserve">under heaven given among men, whereby we must be saved.</w:t>
+      </w:r>
+      <w:r>
+        <w:rPr>
+          <w:i/>
+          <w:iCs/>
+        </w:rPr>
+        <w:t xml:space="preserve">”</w:t>
+      </w:r>
+      <w:r>
+        <w:t xml:space="preserve"> </w:t>
+      </w:r>
+      <w:r>
+        <w:t xml:space="preserve">—</w:t>
+      </w:r>
+      <w:r>
+        <w:t xml:space="preserve"> </w:t>
+      </w:r>
+      <w:r>
+        <w:rPr>
+          <w:b/>
+          <w:bCs/>
+        </w:rPr>
+        <w:t xml:space="preserve">Ma’asiym (Acts) 4:12</w:t>
+      </w:r>
+    </w:p>
+    <w:p>
+      <w:pPr>
+        <w:pStyle w:val="BlockText"/>
+      </w:pPr>
+      <w:r>
+        <w:rPr>
+          <w:i/>
+          <w:iCs/>
+        </w:rPr>
+        <w:t xml:space="preserve">“</w:t>
+      </w:r>
+      <w:r>
+        <w:rPr>
+          <w:i/>
+          <w:iCs/>
+        </w:rPr>
+        <w:t xml:space="preserve">And it shall come to pass, that whosoever shall</w:t>
+      </w:r>
+      <w:r>
+        <w:rPr>
+          <w:i/>
+          <w:iCs/>
+        </w:rPr>
+        <w:t xml:space="preserve"> </w:t>
+      </w:r>
+      <w:r>
+        <w:rPr>
+          <w:b/>
+          <w:bCs/>
+          <w:i/>
+          <w:iCs/>
+        </w:rPr>
+        <w:t xml:space="preserve">call on the name of Yahuah</w:t>
+      </w:r>
+      <w:r>
+        <w:rPr>
+          <w:i/>
+          <w:iCs/>
+        </w:rPr>
+        <w:t xml:space="preserve"> </w:t>
+      </w:r>
+      <w:r>
+        <w:rPr>
+          <w:i/>
+          <w:iCs/>
+        </w:rPr>
+        <w:t xml:space="preserve">shall be delivered.</w:t>
+      </w:r>
+      <w:r>
+        <w:rPr>
+          <w:i/>
+          <w:iCs/>
+        </w:rPr>
+        <w:t xml:space="preserve">”</w:t>
+      </w:r>
+      <w:r>
+        <w:t xml:space="preserve"> </w:t>
+      </w:r>
+      <w:r>
+        <w:t xml:space="preserve">—</w:t>
+      </w:r>
+      <w:r>
+        <w:t xml:space="preserve"> </w:t>
+      </w:r>
+      <w:r>
+        <w:rPr>
+          <w:b/>
+          <w:bCs/>
+        </w:rPr>
+        <w:t xml:space="preserve">Yo’el (Joel) 2:32</w:t>
+      </w:r>
+    </w:p>
+    <w:p>
+      <w:pPr>
+        <w:pStyle w:val="BlockText"/>
+      </w:pPr>
+      <w:r>
+        <w:rPr>
+          <w:i/>
+          <w:iCs/>
+        </w:rPr>
+        <w:t xml:space="preserve">“</w:t>
+      </w:r>
+      <w:r>
+        <w:rPr>
+          <w:b/>
+          <w:bCs/>
+          <w:i/>
+          <w:iCs/>
+        </w:rPr>
+        <w:t xml:space="preserve">I have manifested your name</w:t>
+      </w:r>
+      <w:r>
+        <w:rPr>
+          <w:i/>
+          <w:iCs/>
+        </w:rPr>
+        <w:t xml:space="preserve"> </w:t>
+      </w:r>
+      <w:r>
+        <w:rPr>
+          <w:i/>
+          <w:iCs/>
+        </w:rPr>
+        <w:t xml:space="preserve">unto the men which you gave me out of the world.</w:t>
+      </w:r>
+      <w:r>
+        <w:rPr>
+          <w:i/>
+          <w:iCs/>
+        </w:rPr>
+        <w:t xml:space="preserve">”</w:t>
+      </w:r>
+      <w:r>
+        <w:t xml:space="preserve"> </w:t>
+      </w:r>
+      <w:r>
+        <w:t xml:space="preserve">—</w:t>
+      </w:r>
+      <w:r>
+        <w:t xml:space="preserve"> </w:t>
+      </w:r>
+      <w:r>
+        <w:rPr>
+          <w:b/>
+          <w:bCs/>
+        </w:rPr>
+        <w:t xml:space="preserve">Yahuchanon (John) 17:6</w:t>
+      </w:r>
+    </w:p>
+    <w:p>
+      <w:pPr>
+        <w:pStyle w:val="FirstParagraph"/>
       </w:pPr>
       <w:r>
         <w:t xml:space="preserve">This is not about pronunciation preferences.</w:t>

</xml_diff>

<commit_message>
Add scriptural and gematria evidence to support name change
Updates the ebook and web reader content to include John 5:43 and the gematria of "Jesus Christ" as 666 in the "Note on the Name" section.

Replit-Commit-Author: Agent
Replit-Commit-Session-Id: 715fc2d1-ade6-462c-82fe-64cd42a1fd4f
Replit-Commit-Checkpoint-Type: full_checkpoint
Replit-Commit-Event-Id: e738a289-62d7-40d0-83c6-245b5825d713
Replit-Commit-Screenshot-Url: https://storage.googleapis.com/screenshot-production-us-central1/605f8aff-5e91-4581-9509-5e471a311930/715fc2d1-ade6-462c-82fe-64cd42a1fd4f/iE4J3SC
Replit-Helium-Checkpoint-Created: true
</commit_message>
<xml_diff>
--- a/attached_assets/Through-The-Veil-KINDLE.docx
+++ b/attached_assets/Through-The-Veil-KINDLE.docx
@@ -999,6 +999,218 @@
           <w:bCs/>
         </w:rPr>
         <w:t xml:space="preserve">yet connects to the wrong source.</w:t>
+      </w:r>
+    </w:p>
+    <w:p>
+      <w:pPr>
+        <w:pStyle w:val="BodyText"/>
+      </w:pPr>
+      <w:r>
+        <w:rPr>
+          <w:b/>
+          <w:bCs/>
+        </w:rPr>
+        <w:t xml:space="preserve">The scriptures warned us this would happen:</w:t>
+      </w:r>
+    </w:p>
+    <w:p>
+      <w:pPr>
+        <w:pStyle w:val="BlockText"/>
+      </w:pPr>
+      <w:r>
+        <w:rPr>
+          <w:i/>
+          <w:iCs/>
+        </w:rPr>
+        <w:t xml:space="preserve">“</w:t>
+      </w:r>
+      <w:r>
+        <w:rPr>
+          <w:i/>
+          <w:iCs/>
+        </w:rPr>
+        <w:t xml:space="preserve">I am come in my Father’s name, and ye receive me not: if another shall come in his own name, him ye will receive.</w:t>
+      </w:r>
+      <w:r>
+        <w:rPr>
+          <w:i/>
+          <w:iCs/>
+        </w:rPr>
+        <w:t xml:space="preserve">”</w:t>
+      </w:r>
+      <w:r>
+        <w:t xml:space="preserve"> </w:t>
+      </w:r>
+      <w:r>
+        <w:t xml:space="preserve">—</w:t>
+      </w:r>
+      <w:r>
+        <w:t xml:space="preserve"> </w:t>
+      </w:r>
+      <w:r>
+        <w:rPr>
+          <w:b/>
+          <w:bCs/>
+        </w:rPr>
+        <w:t xml:space="preserve">Yahuchanon (John) 5:43</w:t>
+      </w:r>
+    </w:p>
+    <w:p>
+      <w:pPr>
+        <w:pStyle w:val="FirstParagraph"/>
+      </w:pPr>
+      <w:r>
+        <w:t xml:space="preserve">Yahusha came</w:t>
+      </w:r>
+      <w:r>
+        <w:t xml:space="preserve"> </w:t>
+      </w:r>
+      <w:r>
+        <w:rPr>
+          <w:b/>
+          <w:bCs/>
+        </w:rPr>
+        <w:t xml:space="preserve">in His Father’s name</w:t>
+      </w:r>
+      <w:r>
+        <w:t xml:space="preserve"> </w:t>
+      </w:r>
+      <w:r>
+        <w:t xml:space="preserve">- the name Yahuah is literally embedded in Yahusha. The Father’s name is part of the Son’s identity. That’s what</w:t>
+      </w:r>
+      <w:r>
+        <w:t xml:space="preserve"> </w:t>
+      </w:r>
+      <w:r>
+        <w:t xml:space="preserve">“</w:t>
+      </w:r>
+      <w:r>
+        <w:t xml:space="preserve">coming in my Father’s name</w:t>
+      </w:r>
+      <w:r>
+        <w:t xml:space="preserve">”</w:t>
+      </w:r>
+      <w:r>
+        <w:t xml:space="preserve"> </w:t>
+      </w:r>
+      <w:r>
+        <w:t xml:space="preserve">means.</w:t>
+      </w:r>
+    </w:p>
+    <w:p>
+      <w:pPr>
+        <w:pStyle w:val="BodyText"/>
+      </w:pPr>
+      <w:r>
+        <w:t xml:space="preserve">But another would come</w:t>
+      </w:r>
+      <w:r>
+        <w:t xml:space="preserve"> </w:t>
+      </w:r>
+      <w:r>
+        <w:rPr>
+          <w:b/>
+          <w:bCs/>
+        </w:rPr>
+        <w:t xml:space="preserve">in the name of a man</w:t>
+      </w:r>
+      <w:r>
+        <w:t xml:space="preserve"> </w:t>
+      </w:r>
+      <w:r>
+        <w:t xml:space="preserve">- and him they would receive. The name</w:t>
+      </w:r>
+      <w:r>
+        <w:t xml:space="preserve"> </w:t>
+      </w:r>
+      <w:r>
+        <w:t xml:space="preserve">“</w:t>
+      </w:r>
+      <w:r>
+        <w:t xml:space="preserve">Jesus Christ</w:t>
+      </w:r>
+      <w:r>
+        <w:t xml:space="preserve">”</w:t>
+      </w:r>
+      <w:r>
+        <w:t xml:space="preserve"> </w:t>
+      </w:r>
+      <w:r>
+        <w:t xml:space="preserve">is the name of a man. A Greek-Latin-English construction that contains no trace of the Father’s name. And it has been received by billions.</w:t>
+      </w:r>
+    </w:p>
+    <w:p>
+      <w:pPr>
+        <w:pStyle w:val="BodyText"/>
+      </w:pPr>
+      <w:r>
+        <w:rPr>
+          <w:b/>
+          <w:bCs/>
+        </w:rPr>
+        <w:t xml:space="preserve">The gematria confirms it:</w:t>
+      </w:r>
+    </w:p>
+    <w:p>
+      <w:pPr>
+        <w:pStyle w:val="BodyText"/>
+      </w:pPr>
+      <w:r>
+        <w:t xml:space="preserve">In Greek gematria, the name</w:t>
+      </w:r>
+      <w:r>
+        <w:t xml:space="preserve"> </w:t>
+      </w:r>
+      <w:r>
+        <w:t xml:space="preserve">“</w:t>
+      </w:r>
+      <w:r>
+        <w:t xml:space="preserve">Jesus Christ</w:t>
+      </w:r>
+      <w:r>
+        <w:t xml:space="preserve">”</w:t>
+      </w:r>
+      <w:r>
+        <w:t xml:space="preserve"> </w:t>
+      </w:r>
+      <w:r>
+        <w:t xml:space="preserve">(Ἰησοῦς Χριστός) calculates to</w:t>
+      </w:r>
+      <w:r>
+        <w:t xml:space="preserve"> </w:t>
+      </w:r>
+      <w:r>
+        <w:rPr>
+          <w:b/>
+          <w:bCs/>
+        </w:rPr>
+        <w:t xml:space="preserve">666</w:t>
+      </w:r>
+      <w:r>
+        <w:t xml:space="preserve"> </w:t>
+      </w:r>
+      <w:r>
+        <w:t xml:space="preserve">- the number of the beast, described in Chazon (Revelation) 13:18 as</w:t>
+      </w:r>
+      <w:r>
+        <w:t xml:space="preserve"> </w:t>
+      </w:r>
+      <w:r>
+        <w:t xml:space="preserve">“</w:t>
+      </w:r>
+      <w:r>
+        <w:t xml:space="preserve">the number of a man.</w:t>
+      </w:r>
+      <w:r>
+        <w:t xml:space="preserve">”</w:t>
+      </w:r>
+    </w:p>
+    <w:p>
+      <w:pPr>
+        <w:pStyle w:val="BodyText"/>
+      </w:pPr>
+      <w:r>
+        <w:t xml:space="preserve">This is not coincidence. This is signature. The adversary signs his work. And the Roman deception machine - Constantine and those who followed - knew exactly what they were doing when they replaced the name that connects to the Father with a name that connects to something else entirely.</w:t>
       </w:r>
     </w:p>
     <w:p>

</xml_diff>

<commit_message>
Add author's thoughts to ebook chapters about fallen angels and pagan influences
Integrates user insights into the markdown ebook and web reader, adding "Author's Thoughts" sections to chapters discussing fallen angels, the "Yashar'el vs. Israel" concept, and the inversion of the "Dark Ages" as a deliberate deception. Also updates EPUB and DOCX generation.

Replit-Commit-Author: Agent
Replit-Commit-Session-Id: 715fc2d1-ade6-462c-82fe-64cd42a1fd4f
Replit-Commit-Checkpoint-Type: intermediate_checkpoint
Replit-Commit-Event-Id: ff9662f6-42e5-4513-94e9-d7f0c73a26ab
Replit-Commit-Screenshot-Url: https://storage.googleapis.com/screenshot-production-us-central1/605f8aff-5e91-4581-9509-5e471a311930/715fc2d1-ade6-462c-82fe-64cd42a1fd4f/oX6EVO0
Replit-Helium-Checkpoint-Created: true
</commit_message>
<xml_diff>
--- a/attached_assets/Through-The-Veil-KINDLE.docx
+++ b/attached_assets/Through-The-Veil-KINDLE.docx
@@ -18,6 +18,32 @@
         <w:t xml:space="preserve">Jason Andrews</w:t>
       </w:r>
     </w:p>
+    <w:sdt>
+      <w:sdtPr>
+        <w:docPartObj>
+          <w:docPartGallery w:val="Table of Contents"/>
+          <w:docPartUnique/>
+        </w:docPartObj>
+      </w:sdtPr>
+      <w:sdtContent>
+        <w:p>
+          <w:pPr>
+            <w:pStyle w:val="TOCHeading"/>
+          </w:pPr>
+          <w:r>
+            <w:t xml:space="preserve">Table of Contents</w:t>
+          </w:r>
+        </w:p>
+        <w:p>
+          <w:r>
+            <w:fldChar w:fldCharType="begin" w:dirty="true"/>
+            <w:instrText xml:space="preserve">TOC \o "1-2" \h \z \u</w:instrText>
+            <w:fldChar w:fldCharType="separate"/>
+            <w:fldChar w:fldCharType="end"/>
+          </w:r>
+        </w:p>
+      </w:sdtContent>
+    </w:sdt>
     <w:bookmarkStart w:id="28" w:name="through-the-veil"/>
     <w:p>
       <w:pPr>
@@ -2205,7 +2231,7 @@
       </w:r>
     </w:p>
     <w:bookmarkEnd w:id="30"/>
-    <w:bookmarkStart w:id="31" w:name="chapter-2-the-200-watchers-descend"/>
+    <w:bookmarkStart w:id="32" w:name="chapter-2-the-200-watchers-descend"/>
     <w:p>
       <w:pPr>
         <w:pStyle w:val="Heading1"/>
@@ -2328,6 +2354,171 @@
       </w:pPr>
       <w:r>
         <w:t xml:space="preserve">Instead, the evidence points to cataclysm. To judgment. To a history that was deliberately erased and replaced with a story designed to obscure the truth about who humanity is and what happened to the world before.</w:t>
+      </w:r>
+    </w:p>
+    <w:bookmarkStart w:id="31" w:name="authors-thoughts"/>
+    <w:p>
+      <w:pPr>
+        <w:pStyle w:val="Heading3"/>
+      </w:pPr>
+      <w:r>
+        <w:t xml:space="preserve">✦ AUTHOR’S THOUGHTS ✦</w:t>
+      </w:r>
+    </w:p>
+    <w:p>
+      <w:pPr>
+        <w:pStyle w:val="FirstParagraph"/>
+      </w:pPr>
+      <w:r>
+        <w:t xml:space="preserve">Celebrities are called</w:t>
+      </w:r>
+      <w:r>
+        <w:t xml:space="preserve"> </w:t>
+      </w:r>
+      <w:r>
+        <w:rPr>
+          <w:b/>
+          <w:bCs/>
+        </w:rPr>
+        <w:t xml:space="preserve">“</w:t>
+      </w:r>
+      <w:r>
+        <w:rPr>
+          <w:b/>
+          <w:bCs/>
+        </w:rPr>
+        <w:t xml:space="preserve">stars</w:t>
+      </w:r>
+      <w:r>
+        <w:rPr>
+          <w:b/>
+          <w:bCs/>
+        </w:rPr>
+        <w:t xml:space="preserve">”</w:t>
+      </w:r>
+      <w:r>
+        <w:t xml:space="preserve"> </w:t>
+      </w:r>
+      <w:r>
+        <w:t xml:space="preserve">- and fallen angels were cast down from heaven as falling stars (Chizayon 12:4, Yesha’yahu 14:12). Many prominent</w:t>
+      </w:r>
+      <w:r>
+        <w:t xml:space="preserve"> </w:t>
+      </w:r>
+      <w:r>
+        <w:t xml:space="preserve">“</w:t>
+      </w:r>
+      <w:r>
+        <w:t xml:space="preserve">stars</w:t>
+      </w:r>
+      <w:r>
+        <w:t xml:space="preserve">”</w:t>
+      </w:r>
+      <w:r>
+        <w:t xml:space="preserve"> </w:t>
+      </w:r>
+      <w:r>
+        <w:t xml:space="preserve">bear El names. Some appear to reverse-age inexplicably. They’re paid to stupefy, distract, mesmerize - to hypnotize the masses while mocking the true Elohiym simultaneously.</w:t>
+      </w:r>
+    </w:p>
+    <w:p>
+      <w:pPr>
+        <w:pStyle w:val="BodyText"/>
+      </w:pPr>
+      <w:r>
+        <w:t xml:space="preserve">It’s spiritual and subconscious, but it all matters. The physical realm is merely an encasement for spirit, and every nuance - even the ones we never consciously notice - is where the hooks are set.</w:t>
+      </w:r>
+    </w:p>
+    <w:p>
+      <w:pPr>
+        <w:pStyle w:val="BodyText"/>
+      </w:pPr>
+      <w:r>
+        <w:t xml:space="preserve">Perhaps many who display the symbols have themselves been deceived. They may genuinely believe they are part of something chosen - that they have witnessed miracles, that they know who the true messiah is, that the timing simply hasn’t been right for his public revelation.</w:t>
+      </w:r>
+    </w:p>
+    <w:p>
+      <w:pPr>
+        <w:pStyle w:val="BodyText"/>
+      </w:pPr>
+      <w:r>
+        <w:t xml:space="preserve">When people call them</w:t>
+      </w:r>
+      <w:r>
+        <w:t xml:space="preserve"> </w:t>
+      </w:r>
+      <w:r>
+        <w:t xml:space="preserve">“</w:t>
+      </w:r>
+      <w:r>
+        <w:t xml:space="preserve">Illuminati</w:t>
+      </w:r>
+      <w:r>
+        <w:t xml:space="preserve">”</w:t>
+      </w:r>
+      <w:r>
+        <w:t xml:space="preserve"> </w:t>
+      </w:r>
+      <w:r>
+        <w:t xml:space="preserve">or</w:t>
+      </w:r>
+      <w:r>
+        <w:t xml:space="preserve"> </w:t>
+      </w:r>
+      <w:r>
+        <w:t xml:space="preserve">“</w:t>
+      </w:r>
+      <w:r>
+        <w:t xml:space="preserve">out of touch,</w:t>
+      </w:r>
+      <w:r>
+        <w:t xml:space="preserve">”</w:t>
+      </w:r>
+      <w:r>
+        <w:t xml:space="preserve"> </w:t>
+      </w:r>
+      <w:r>
+        <w:t xml:space="preserve">they can laugh. The Illuminati as a formal organization may no longer exist. But the spirit behind it continues. And if these initiates truly believe they serve the returning messiah - if they have seen things that convinced them - their confidence makes sense. They’re not nervous because they believe they’re on the winning side.</w:t>
+      </w:r>
+    </w:p>
+    <w:p>
+      <w:pPr>
+        <w:pStyle w:val="BodyText"/>
+      </w:pPr>
+      <w:r>
+        <w:rPr>
+          <w:i/>
+          <w:iCs/>
+        </w:rPr>
+        <w:t xml:space="preserve">Some of these people seem to get younger. Inexplicably. They have access to things the public does not. Perhaps their benefactor waits in the wings, building an army of witnesses who will say:</w:t>
+      </w:r>
+      <w:r>
+        <w:rPr>
+          <w:i/>
+          <w:iCs/>
+        </w:rPr>
+        <w:t xml:space="preserve"> </w:t>
+      </w:r>
+      <w:r>
+        <w:rPr>
+          <w:i/>
+          <w:iCs/>
+        </w:rPr>
+        <w:t xml:space="preserve">“</w:t>
+      </w:r>
+      <w:r>
+        <w:rPr>
+          <w:i/>
+          <w:iCs/>
+        </w:rPr>
+        <w:t xml:space="preserve">No, you don’t understand. I’ve seen him. I’ve seen the miracles. This is the one.</w:t>
+      </w:r>
+      <w:r>
+        <w:rPr>
+          <w:i/>
+          <w:iCs/>
+        </w:rPr>
+        <w:t xml:space="preserve">”</w:t>
       </w:r>
     </w:p>
     <w:p>
@@ -2338,7 +2529,8 @@
       </w:r>
     </w:p>
     <w:bookmarkEnd w:id="31"/>
-    <w:bookmarkStart w:id="32" w:name="chapter-3-the-forbidden-knowledge"/>
+    <w:bookmarkEnd w:id="32"/>
+    <w:bookmarkStart w:id="33" w:name="chapter-3-the-forbidden-knowledge"/>
     <w:p>
       <w:pPr>
         <w:pStyle w:val="Heading1"/>
@@ -2428,8 +2620,8 @@
         </w:pict>
       </w:r>
     </w:p>
-    <w:bookmarkEnd w:id="32"/>
-    <w:bookmarkStart w:id="33" w:name="X86c96ae92d2f71cae6d974024d76a4a1260d2dd"/>
+    <w:bookmarkEnd w:id="33"/>
+    <w:bookmarkStart w:id="34" w:name="X86c96ae92d2f71cae6d974024d76a4a1260d2dd"/>
     <w:p>
       <w:pPr>
         <w:pStyle w:val="Heading1"/>
@@ -2577,8 +2769,8 @@
         </w:pict>
       </w:r>
     </w:p>
-    <w:bookmarkEnd w:id="33"/>
-    <w:bookmarkStart w:id="34" w:name="part-two-the-first-reset"/>
+    <w:bookmarkEnd w:id="34"/>
+    <w:bookmarkStart w:id="35" w:name="part-two-the-first-reset"/>
     <w:p>
       <w:pPr>
         <w:pStyle w:val="Heading1"/>
@@ -2594,8 +2786,8 @@
         </w:pict>
       </w:r>
     </w:p>
-    <w:bookmarkEnd w:id="34"/>
-    <w:bookmarkStart w:id="35" w:name="Xef4b2558b3bb05f30b5a09b1f0a59db2575c8b7"/>
+    <w:bookmarkEnd w:id="35"/>
+    <w:bookmarkStart w:id="36" w:name="Xef4b2558b3bb05f30b5a09b1f0a59db2575c8b7"/>
     <w:p>
       <w:pPr>
         <w:pStyle w:val="Heading1"/>
@@ -2703,8 +2895,8 @@
         </w:pict>
       </w:r>
     </w:p>
-    <w:bookmarkEnd w:id="35"/>
-    <w:bookmarkStart w:id="44" w:name="X17f163539ef6246e9723ee09dc3cfabcb7e2b3c"/>
+    <w:bookmarkEnd w:id="36"/>
+    <w:bookmarkStart w:id="45" w:name="X17f163539ef6246e9723ee09dc3cfabcb7e2b3c"/>
     <w:p>
       <w:pPr>
         <w:pStyle w:val="Heading1"/>
@@ -2729,7 +2921,7 @@
         <w:t xml:space="preserve">You can. The evidence exists. And it has been systematically ignored, ridiculed, or buried by mainstream archaeology.</w:t>
       </w:r>
     </w:p>
-    <w:bookmarkStart w:id="36" w:name="sodom-and-gomorrah-the-cities-of-ash"/>
+    <w:bookmarkStart w:id="37" w:name="sodom-and-gomorrah-the-cities-of-ash"/>
     <w:p>
       <w:pPr>
         <w:pStyle w:val="Heading2"/>
@@ -2827,8 +3019,8 @@
         <w:t xml:space="preserve">Some of these artifacts are housed in museums, including one in Tennessee. You can see them. You can hold them. The evidence is tangible - yet mainstream archaeology dismisses it entirely.</w:t>
       </w:r>
     </w:p>
-    <w:bookmarkEnd w:id="36"/>
-    <w:bookmarkStart w:id="37" w:name="mount-sinai-the-burned-mountain"/>
+    <w:bookmarkEnd w:id="37"/>
+    <w:bookmarkStart w:id="38" w:name="mount-sinai-the-burned-mountain"/>
     <w:p>
       <w:pPr>
         <w:pStyle w:val="Heading2"/>
@@ -2902,8 +3094,8 @@
         <w:t xml:space="preserve">The Saudi government initially fenced the entire area as a restricted archaeological zone. The evidence is too significant to allow public access.</w:t>
       </w:r>
     </w:p>
-    <w:bookmarkEnd w:id="37"/>
-    <w:bookmarkStart w:id="38" w:name="X9c60f29034354da5586b27aacb43dc910ca40da"/>
+    <w:bookmarkEnd w:id="38"/>
+    <w:bookmarkStart w:id="39" w:name="X9c60f29034354da5586b27aacb43dc910ca40da"/>
     <w:p>
       <w:pPr>
         <w:pStyle w:val="Heading2"/>
@@ -3011,8 +3203,8 @@
         <w:t xml:space="preserve">and collapsed on the Egyptian army.</w:t>
       </w:r>
     </w:p>
-    <w:bookmarkEnd w:id="38"/>
-    <w:bookmarkStart w:id="39" w:name="noahs-ark-the-boat-shaped-formation"/>
+    <w:bookmarkEnd w:id="39"/>
+    <w:bookmarkStart w:id="40" w:name="noahs-ark-the-boat-shaped-formation"/>
     <w:p>
       <w:pPr>
         <w:pStyle w:val="Heading2"/>
@@ -3089,8 +3281,8 @@
         <w:t xml:space="preserve">The Turkish government has designated this area as a national park and constructed a visitor center. They take the identification seriously, even if Western academia does not.</w:t>
       </w:r>
     </w:p>
-    <w:bookmarkEnd w:id="39"/>
-    <w:bookmarkStart w:id="40" w:name="the-giant-tree-stumps"/>
+    <w:bookmarkEnd w:id="40"/>
+    <w:bookmarkStart w:id="41" w:name="the-giant-tree-stumps"/>
     <w:p>
       <w:pPr>
         <w:pStyle w:val="Heading2"/>
@@ -3203,8 +3395,8 @@
         <w:t xml:space="preserve">Similar formations exist worldwide. Mesas throughout the American Southwest with flat tops and striated sides. Table mountains in Africa. Buttes across every continent. What if these aren’t geological formations but the remains of a pre-flood mega-flora - trees that grew thousands of feet tall in an atmosphere with higher oxygen content?</w:t>
       </w:r>
     </w:p>
-    <w:bookmarkEnd w:id="40"/>
-    <w:bookmarkStart w:id="41" w:name="X6265064448129f6239102126bf8d7c54ee11836"/>
+    <w:bookmarkEnd w:id="41"/>
+    <w:bookmarkStart w:id="42" w:name="X6265064448129f6239102126bf8d7c54ee11836"/>
     <w:p>
       <w:pPr>
         <w:pStyle w:val="Heading2"/>
@@ -3245,8 +3437,8 @@
         <w:t xml:space="preserve">Whether this discovery is genuine remains a matter of faith. But the location makes theological sense: the blood of the ultimate sacrifice dripping onto the mercy seat where blood was always required for atonement.</w:t>
       </w:r>
     </w:p>
-    <w:bookmarkEnd w:id="41"/>
-    <w:bookmarkStart w:id="42" w:name="additional-documented-discoveries"/>
+    <w:bookmarkEnd w:id="42"/>
+    <w:bookmarkStart w:id="43" w:name="additional-documented-discoveries"/>
     <w:p>
       <w:pPr>
         <w:pStyle w:val="Heading2"/>
@@ -3309,8 +3501,8 @@
         <w:t xml:space="preserve">Archaeological evidence at Tell es-Sultan showing walls that fell outward (not inward as in a siege) and a city burned with its grain stores intact - exactly as Yahusha (Joshua) describes.</w:t>
       </w:r>
     </w:p>
-    <w:bookmarkEnd w:id="42"/>
-    <w:bookmarkStart w:id="43" w:name="why-you-havent-heard-about-this"/>
+    <w:bookmarkEnd w:id="43"/>
+    <w:bookmarkStart w:id="44" w:name="why-you-havent-heard-about-this"/>
     <w:p>
       <w:pPr>
         <w:pStyle w:val="Heading2"/>
@@ -3358,9 +3550,9 @@
         </w:pict>
       </w:r>
     </w:p>
-    <w:bookmarkEnd w:id="43"/>
     <w:bookmarkEnd w:id="44"/>
-    <w:bookmarkStart w:id="45" w:name="chapter-6-dragons-not-dinosaurs"/>
+    <w:bookmarkEnd w:id="45"/>
+    <w:bookmarkStart w:id="46" w:name="chapter-6-dragons-not-dinosaurs"/>
     <w:p>
       <w:pPr>
         <w:pStyle w:val="Heading1"/>
@@ -3542,8 +3734,8 @@
         </w:pict>
       </w:r>
     </w:p>
-    <w:bookmarkEnd w:id="45"/>
-    <w:bookmarkStart w:id="46" w:name="Xa1aca8cde1c2f724951ae09df0db94b25b355c8"/>
+    <w:bookmarkEnd w:id="46"/>
+    <w:bookmarkStart w:id="47" w:name="Xa1aca8cde1c2f724951ae09df0db94b25b355c8"/>
     <w:p>
       <w:pPr>
         <w:pStyle w:val="Heading1"/>
@@ -3639,8 +3831,8 @@
         </w:pict>
       </w:r>
     </w:p>
-    <w:bookmarkEnd w:id="46"/>
-    <w:bookmarkStart w:id="47" w:name="part-three-the-scattering"/>
+    <w:bookmarkEnd w:id="47"/>
+    <w:bookmarkStart w:id="48" w:name="part-three-the-scattering"/>
     <w:p>
       <w:pPr>
         <w:pStyle w:val="Heading1"/>
@@ -3656,8 +3848,8 @@
         </w:pict>
       </w:r>
     </w:p>
-    <w:bookmarkEnd w:id="47"/>
-    <w:bookmarkStart w:id="48" w:name="X58693d769338d8906c3ec12141d29713eae8afc"/>
+    <w:bookmarkEnd w:id="48"/>
+    <w:bookmarkStart w:id="50" w:name="X58693d769338d8906c3ec12141d29713eae8afc"/>
     <w:p>
       <w:pPr>
         <w:pStyle w:val="Heading1"/>
@@ -3772,6 +3964,614 @@
       </w:r>
       <w:r>
         <w:t xml:space="preserve">”</w:t>
+      </w:r>
+    </w:p>
+    <w:bookmarkStart w:id="49" w:name="authors-thoughts-1"/>
+    <w:p>
+      <w:pPr>
+        <w:pStyle w:val="Heading3"/>
+      </w:pPr>
+      <w:r>
+        <w:t xml:space="preserve">✦ AUTHOR’S THOUGHTS ✦</w:t>
+      </w:r>
+    </w:p>
+    <w:p>
+      <w:pPr>
+        <w:pStyle w:val="FirstParagraph"/>
+      </w:pPr>
+      <w:r>
+        <w:rPr>
+          <w:b/>
+          <w:bCs/>
+        </w:rPr>
+        <w:t xml:space="preserve">Yashar’el vs. </w:t>
+      </w:r>
+      <w:r>
+        <w:rPr>
+          <w:b/>
+          <w:bCs/>
+        </w:rPr>
+        <w:t xml:space="preserve">“</w:t>
+      </w:r>
+      <w:r>
+        <w:rPr>
+          <w:b/>
+          <w:bCs/>
+        </w:rPr>
+        <w:t xml:space="preserve">Israel</w:t>
+      </w:r>
+      <w:r>
+        <w:rPr>
+          <w:b/>
+          <w:bCs/>
+        </w:rPr>
+        <w:t xml:space="preserve">”</w:t>
+      </w:r>
+      <w:r>
+        <w:rPr>
+          <w:b/>
+          <w:bCs/>
+        </w:rPr>
+        <w:t xml:space="preserve">: The Isis-Ra-El Question</w:t>
+      </w:r>
+    </w:p>
+    <w:p>
+      <w:pPr>
+        <w:pStyle w:val="BodyText"/>
+      </w:pPr>
+      <w:r>
+        <w:t xml:space="preserve">The Cepher explained that</w:t>
+      </w:r>
+      <w:r>
+        <w:t xml:space="preserve"> </w:t>
+      </w:r>
+      <w:r>
+        <w:rPr>
+          <w:b/>
+          <w:bCs/>
+        </w:rPr>
+        <w:t xml:space="preserve">Yashar’el</w:t>
+      </w:r>
+      <w:r>
+        <w:t xml:space="preserve"> </w:t>
+      </w:r>
+      <w:r>
+        <w:t xml:space="preserve">means</w:t>
+      </w:r>
+      <w:r>
+        <w:t xml:space="preserve"> </w:t>
+      </w:r>
+      <w:r>
+        <w:t xml:space="preserve">“</w:t>
+      </w:r>
+      <w:r>
+        <w:t xml:space="preserve">Upright with the Almighty</w:t>
+      </w:r>
+      <w:r>
+        <w:t xml:space="preserve">”</w:t>
+      </w:r>
+      <w:r>
+        <w:t xml:space="preserve"> </w:t>
+      </w:r>
+      <w:r>
+        <w:t xml:space="preserve">- a spiritual transformation, not a geographic designation. Jacob went from crooked (Ya’akov) to upright (Yashar’el). A change in character, not a change in address. Here’s what I saw when I looked at the English word</w:t>
+      </w:r>
+      <w:r>
+        <w:t xml:space="preserve"> </w:t>
+      </w:r>
+      <w:r>
+        <w:t xml:space="preserve">“</w:t>
+      </w:r>
+      <w:r>
+        <w:t xml:space="preserve">Israel.</w:t>
+      </w:r>
+      <w:r>
+        <w:t xml:space="preserve">”</w:t>
+      </w:r>
+    </w:p>
+    <w:p>
+      <w:pPr>
+        <w:pStyle w:val="BodyText"/>
+      </w:pPr>
+      <w:r>
+        <w:rPr>
+          <w:b/>
+          <w:bCs/>
+        </w:rPr>
+        <w:t xml:space="preserve">Spiritual Yashar’el</w:t>
+      </w:r>
+      <w:r>
+        <w:t xml:space="preserve"> </w:t>
+      </w:r>
+      <w:r>
+        <w:t xml:space="preserve">refers to those living in covenant relationship with Yahuah - the scattered remnant with eyes to see and ears to hear. They could be anywhere in the world, from any nation, any background. The upright ones aligned with the Creator.</w:t>
+      </w:r>
+    </w:p>
+    <w:p>
+      <w:pPr>
+        <w:pStyle w:val="BodyText"/>
+      </w:pPr>
+      <w:r>
+        <w:rPr>
+          <w:b/>
+          <w:bCs/>
+        </w:rPr>
+        <w:t xml:space="preserve">The modern nation-state</w:t>
+      </w:r>
+      <w:r>
+        <w:t xml:space="preserve"> </w:t>
+      </w:r>
+      <w:r>
+        <w:t xml:space="preserve">(established 1948) is a geopolitical entity, created through political powers - the British Mandate, UN Resolution 181, and significant Rothschild financing. Everyone watches a geographic location for prophetic fulfillment while the true Yashar’el is spiritual and scattered across the earth.</w:t>
+      </w:r>
+    </w:p>
+    <w:p>
+      <w:pPr>
+        <w:pStyle w:val="BodyText"/>
+      </w:pPr>
+      <w:r>
+        <w:t xml:space="preserve">Now here is where it gets striking. Some have noted that the English word could be heard as a combination of pagan deities:</w:t>
+      </w:r>
+      <w:r>
+        <w:t xml:space="preserve"> </w:t>
+      </w:r>
+      <w:r>
+        <w:rPr>
+          <w:b/>
+          <w:bCs/>
+        </w:rPr>
+        <w:t xml:space="preserve">Isis</w:t>
+      </w:r>
+      <w:r>
+        <w:t xml:space="preserve"> </w:t>
+      </w:r>
+      <w:r>
+        <w:t xml:space="preserve">(Egyptian goddess) +</w:t>
+      </w:r>
+      <w:r>
+        <w:t xml:space="preserve"> </w:t>
+      </w:r>
+      <w:r>
+        <w:rPr>
+          <w:b/>
+          <w:bCs/>
+        </w:rPr>
+        <w:t xml:space="preserve">Ra</w:t>
+      </w:r>
+      <w:r>
+        <w:t xml:space="preserve"> </w:t>
+      </w:r>
+      <w:r>
+        <w:t xml:space="preserve">(Egyptian sun god) +</w:t>
+      </w:r>
+      <w:r>
+        <w:t xml:space="preserve"> </w:t>
+      </w:r>
+      <w:r>
+        <w:rPr>
+          <w:b/>
+          <w:bCs/>
+        </w:rPr>
+        <w:t xml:space="preserve">El</w:t>
+      </w:r>
+      <w:r>
+        <w:t xml:space="preserve">. Say it slowly. Is-Ra-El. Three names. Two of them are Egyptian deities the Ivriym were explicitly commanded to reject.</w:t>
+      </w:r>
+    </w:p>
+    <w:p>
+      <w:pPr>
+        <w:pStyle w:val="BlockText"/>
+      </w:pPr>
+      <w:r>
+        <w:rPr>
+          <w:b/>
+          <w:bCs/>
+        </w:rPr>
+        <w:t xml:space="preserve">Two false deities placed BEFORE El</w:t>
+      </w:r>
+      <w:r>
+        <w:t xml:space="preserve"> </w:t>
+      </w:r>
+      <w:r>
+        <w:t xml:space="preserve">- directly violating</w:t>
+      </w:r>
+      <w:r>
+        <w:t xml:space="preserve"> </w:t>
+      </w:r>
+      <w:r>
+        <w:t xml:space="preserve">“</w:t>
+      </w:r>
+      <w:r>
+        <w:t xml:space="preserve">You shall have no other elohim before me.</w:t>
+      </w:r>
+      <w:r>
+        <w:t xml:space="preserve">”</w:t>
+      </w:r>
+      <w:r>
+        <w:t xml:space="preserve"> </w:t>
+      </w:r>
+      <w:r>
+        <w:t xml:space="preserve">Isis comes first. Then Ra. Then El. The very structure of the word places false gods before the true.</w:t>
+      </w:r>
+    </w:p>
+    <w:p>
+      <w:pPr>
+        <w:pStyle w:val="BlockText"/>
+      </w:pPr>
+      <w:r>
+        <w:rPr>
+          <w:b/>
+          <w:bCs/>
+        </w:rPr>
+        <w:t xml:space="preserve">The reading order reversed</w:t>
+      </w:r>
+      <w:r>
+        <w:t xml:space="preserve"> </w:t>
+      </w:r>
+      <w:r>
+        <w:t xml:space="preserve">- Original Ivriyt (Hebrew) reads right to left; English reads left to right. Even the direction of perception is inverted.</w:t>
+      </w:r>
+    </w:p>
+    <w:p>
+      <w:pPr>
+        <w:pStyle w:val="BlockText"/>
+      </w:pPr>
+      <w:r>
+        <w:rPr>
+          <w:b/>
+          <w:bCs/>
+        </w:rPr>
+        <w:t xml:space="preserve">The geopolitical confusion</w:t>
+      </w:r>
+      <w:r>
+        <w:t xml:space="preserve"> </w:t>
+      </w:r>
+      <w:r>
+        <w:t xml:space="preserve">- People passionately debate this word, take sides, go to war over it - arguing about a word that may encapsulate the entire deception hidden in plain sight.</w:t>
+      </w:r>
+    </w:p>
+    <w:p>
+      <w:pPr>
+        <w:pStyle w:val="FirstParagraph"/>
+      </w:pPr>
+      <w:r>
+        <w:t xml:space="preserve">The same people who dismiss Scripture will take heated, passionate sides on modern geopolitical conflicts - arguing, protesting, even dying over a word that mocks everything encoded in it.</w:t>
+      </w:r>
+    </w:p>
+    <w:p>
+      <w:pPr>
+        <w:pStyle w:val="BodyText"/>
+      </w:pPr>
+      <w:r>
+        <w:rPr>
+          <w:b/>
+          <w:bCs/>
+        </w:rPr>
+        <w:t xml:space="preserve">The Question of</w:t>
+      </w:r>
+      <w:r>
+        <w:rPr>
+          <w:b/>
+          <w:bCs/>
+        </w:rPr>
+        <w:t xml:space="preserve"> </w:t>
+      </w:r>
+      <w:r>
+        <w:rPr>
+          <w:b/>
+          <w:bCs/>
+        </w:rPr>
+        <w:t xml:space="preserve">“</w:t>
+      </w:r>
+      <w:r>
+        <w:rPr>
+          <w:b/>
+          <w:bCs/>
+        </w:rPr>
+        <w:t xml:space="preserve">El</w:t>
+      </w:r>
+      <w:r>
+        <w:rPr>
+          <w:b/>
+          <w:bCs/>
+        </w:rPr>
+        <w:t xml:space="preserve">”</w:t>
+      </w:r>
+      <w:r>
+        <w:rPr>
+          <w:b/>
+          <w:bCs/>
+        </w:rPr>
+        <w:t xml:space="preserve"> </w:t>
+      </w:r>
+      <w:r>
+        <w:rPr>
+          <w:b/>
+          <w:bCs/>
+        </w:rPr>
+        <w:t xml:space="preserve">Names</w:t>
+      </w:r>
+    </w:p>
+    <w:p>
+      <w:pPr>
+        <w:pStyle w:val="BodyText"/>
+      </w:pPr>
+      <w:r>
+        <w:t xml:space="preserve">Scholars debate whether</w:t>
+      </w:r>
+      <w:r>
+        <w:t xml:space="preserve"> </w:t>
+      </w:r>
+      <w:r>
+        <w:t xml:space="preserve">“</w:t>
+      </w:r>
+      <w:r>
+        <w:t xml:space="preserve">El</w:t>
+      </w:r>
+      <w:r>
+        <w:t xml:space="preserve">”</w:t>
+      </w:r>
+      <w:r>
+        <w:t xml:space="preserve"> </w:t>
+      </w:r>
+      <w:r>
+        <w:t xml:space="preserve">(אל) is simply a generic Semitic word for</w:t>
+      </w:r>
+      <w:r>
+        <w:t xml:space="preserve"> </w:t>
+      </w:r>
+      <w:r>
+        <w:t xml:space="preserve">“</w:t>
+      </w:r>
+      <w:r>
+        <w:t xml:space="preserve">mighty one</w:t>
+      </w:r>
+      <w:r>
+        <w:t xml:space="preserve">”</w:t>
+      </w:r>
+      <w:r>
+        <w:t xml:space="preserve"> </w:t>
+      </w:r>
+      <w:r>
+        <w:t xml:space="preserve">- or whether it originally referred to the supreme deity of the Canaanite pantheon, whose attributes were later absorbed by Yahuah.</w:t>
+      </w:r>
+    </w:p>
+    <w:p>
+      <w:pPr>
+        <w:pStyle w:val="BodyText"/>
+      </w:pPr>
+      <w:r>
+        <w:t xml:space="preserve">Consider the prevalence of</w:t>
+      </w:r>
+      <w:r>
+        <w:t xml:space="preserve"> </w:t>
+      </w:r>
+      <w:r>
+        <w:t xml:space="preserve">“</w:t>
+      </w:r>
+      <w:r>
+        <w:t xml:space="preserve">El</w:t>
+      </w:r>
+      <w:r>
+        <w:t xml:space="preserve">”</w:t>
+      </w:r>
+      <w:r>
+        <w:t xml:space="preserve"> </w:t>
+      </w:r>
+      <w:r>
+        <w:t xml:space="preserve">names in positions of power and prominence: Elon, Denzel, Michael, Daniel, Gabriel, Emmanuel. If</w:t>
+      </w:r>
+      <w:r>
+        <w:t xml:space="preserve"> </w:t>
+      </w:r>
+      <w:r>
+        <w:t xml:space="preserve">“</w:t>
+      </w:r>
+      <w:r>
+        <w:t xml:space="preserve">El</w:t>
+      </w:r>
+      <w:r>
+        <w:t xml:space="preserve">”</w:t>
+      </w:r>
+      <w:r>
+        <w:t xml:space="preserve"> </w:t>
+      </w:r>
+      <w:r>
+        <w:t xml:space="preserve">carries hidden allegiance to the Canaanite deity, these names become signals - a mockery understood only by initiates.</w:t>
+      </w:r>
+    </w:p>
+    <w:p>
+      <w:pPr>
+        <w:pStyle w:val="BodyText"/>
+      </w:pPr>
+      <w:r>
+        <w:t xml:space="preserve">Even in fiction, the pattern appears. Superman’s Kryptonian name is</w:t>
+      </w:r>
+      <w:r>
+        <w:t xml:space="preserve"> </w:t>
+      </w:r>
+      <w:r>
+        <w:rPr>
+          <w:b/>
+          <w:bCs/>
+        </w:rPr>
+        <w:t xml:space="preserve">Kal-El</w:t>
+      </w:r>
+      <w:r>
+        <w:t xml:space="preserve">. His father is</w:t>
+      </w:r>
+      <w:r>
+        <w:t xml:space="preserve"> </w:t>
+      </w:r>
+      <w:r>
+        <w:rPr>
+          <w:b/>
+          <w:bCs/>
+        </w:rPr>
+        <w:t xml:space="preserve">Jor-El</w:t>
+      </w:r>
+      <w:r>
+        <w:t xml:space="preserve">. The entire house is the House of El. The</w:t>
+      </w:r>
+      <w:r>
+        <w:t xml:space="preserve"> </w:t>
+      </w:r>
+      <w:r>
+        <w:t xml:space="preserve">“</w:t>
+      </w:r>
+      <w:r>
+        <w:t xml:space="preserve">S</w:t>
+      </w:r>
+      <w:r>
+        <w:t xml:space="preserve">”</w:t>
+      </w:r>
+      <w:r>
+        <w:t xml:space="preserve"> </w:t>
+      </w:r>
+      <w:r>
+        <w:t xml:space="preserve">symbol - often interpreted as the serpent - adorns his chest. A savior figure from the sky, bearing the El name, worshiped by the masses.</w:t>
+      </w:r>
+    </w:p>
+    <w:p>
+      <w:pPr>
+        <w:pStyle w:val="BodyText"/>
+      </w:pPr>
+      <w:r>
+        <w:t xml:space="preserve">Children’s programming featured a villain named</w:t>
+      </w:r>
+      <w:r>
+        <w:t xml:space="preserve"> </w:t>
+      </w:r>
+      <w:r>
+        <w:rPr>
+          <w:b/>
+          <w:bCs/>
+        </w:rPr>
+        <w:t xml:space="preserve">Gargamel</w:t>
+      </w:r>
+      <w:r>
+        <w:t xml:space="preserve"> </w:t>
+      </w:r>
+      <w:r>
+        <w:t xml:space="preserve">and his cat</w:t>
+      </w:r>
+      <w:r>
+        <w:t xml:space="preserve"> </w:t>
+      </w:r>
+      <w:r>
+        <w:rPr>
+          <w:b/>
+          <w:bCs/>
+        </w:rPr>
+        <w:t xml:space="preserve">Azrael</w:t>
+      </w:r>
+      <w:r>
+        <w:t xml:space="preserve"> </w:t>
+      </w:r>
+      <w:r>
+        <w:t xml:space="preserve">- the name of the angel of death in certain traditions. Children absorbed these names every Saturday morning, internalizing them as harmless cartoon characters. By adulthood, the conditioning is complete.</w:t>
+      </w:r>
+    </w:p>
+    <w:p>
+      <w:pPr>
+        <w:pStyle w:val="BodyText"/>
+      </w:pPr>
+      <w:r>
+        <w:rPr>
+          <w:i/>
+          <w:iCs/>
+        </w:rPr>
+        <w:t xml:space="preserve">Some suggest that the proper pronunciation should be</w:t>
+      </w:r>
+      <w:r>
+        <w:rPr>
+          <w:i/>
+          <w:iCs/>
+        </w:rPr>
+        <w:t xml:space="preserve"> </w:t>
+      </w:r>
+      <w:r>
+        <w:rPr>
+          <w:b/>
+          <w:bCs/>
+          <w:i/>
+          <w:iCs/>
+        </w:rPr>
+        <w:t xml:space="preserve">“</w:t>
+      </w:r>
+      <w:r>
+        <w:rPr>
+          <w:b/>
+          <w:bCs/>
+          <w:i/>
+          <w:iCs/>
+        </w:rPr>
+        <w:t xml:space="preserve">AL</w:t>
+      </w:r>
+      <w:r>
+        <w:rPr>
+          <w:b/>
+          <w:bCs/>
+          <w:i/>
+          <w:iCs/>
+        </w:rPr>
+        <w:t xml:space="preserve">”</w:t>
+      </w:r>
+      <w:r>
+        <w:rPr>
+          <w:i/>
+          <w:iCs/>
+        </w:rPr>
+        <w:t xml:space="preserve"> </w:t>
+      </w:r>
+      <w:r>
+        <w:rPr>
+          <w:i/>
+          <w:iCs/>
+        </w:rPr>
+        <w:t xml:space="preserve">rather than</w:t>
+      </w:r>
+      <w:r>
+        <w:rPr>
+          <w:i/>
+          <w:iCs/>
+        </w:rPr>
+        <w:t xml:space="preserve"> </w:t>
+      </w:r>
+      <w:r>
+        <w:rPr>
+          <w:i/>
+          <w:iCs/>
+        </w:rPr>
+        <w:t xml:space="preserve">“</w:t>
+      </w:r>
+      <w:r>
+        <w:rPr>
+          <w:i/>
+          <w:iCs/>
+        </w:rPr>
+        <w:t xml:space="preserve">EL</w:t>
+      </w:r>
+      <w:r>
+        <w:rPr>
+          <w:i/>
+          <w:iCs/>
+        </w:rPr>
+        <w:t xml:space="preserve">”</w:t>
+      </w:r>
+      <w:r>
+        <w:rPr>
+          <w:i/>
+          <w:iCs/>
+        </w:rPr>
+        <w:t xml:space="preserve"> </w:t>
+      </w:r>
+      <w:r>
+        <w:rPr>
+          <w:i/>
+          <w:iCs/>
+        </w:rPr>
+        <w:t xml:space="preserve">- a subtle difference in frequency and sound that may carry significant meaning. If names operate on vibrational frequencies, this small distinction could be the difference between alignment with the Creator and unwitting allegiance to the counterfeit.</w:t>
       </w:r>
     </w:p>
     <w:p>
@@ -3781,8 +4581,9 @@
         </w:pict>
       </w:r>
     </w:p>
-    <w:bookmarkEnd w:id="48"/>
-    <w:bookmarkStart w:id="49" w:name="chapter-9-the-divine-language-lost"/>
+    <w:bookmarkEnd w:id="49"/>
+    <w:bookmarkEnd w:id="50"/>
+    <w:bookmarkStart w:id="51" w:name="chapter-9-the-divine-language-lost"/>
     <w:p>
       <w:pPr>
         <w:pStyle w:val="Heading1"/>
@@ -4008,8 +4809,8 @@
         </w:pict>
       </w:r>
     </w:p>
-    <w:bookmarkEnd w:id="49"/>
-    <w:bookmarkStart w:id="50" w:name="chapter-10-spelling-as-spellcasting"/>
+    <w:bookmarkEnd w:id="51"/>
+    <w:bookmarkStart w:id="52" w:name="chapter-10-spelling-as-spellcasting"/>
     <w:p>
       <w:pPr>
         <w:pStyle w:val="Heading1"/>
@@ -4466,8 +5267,8 @@
         </w:pict>
       </w:r>
     </w:p>
-    <w:bookmarkEnd w:id="50"/>
-    <w:bookmarkStart w:id="51" w:name="part-four-the-hidden-rulers"/>
+    <w:bookmarkEnd w:id="52"/>
+    <w:bookmarkStart w:id="53" w:name="part-four-the-hidden-rulers"/>
     <w:p>
       <w:pPr>
         <w:pStyle w:val="Heading1"/>
@@ -4483,8 +5284,8 @@
         </w:pict>
       </w:r>
     </w:p>
-    <w:bookmarkEnd w:id="51"/>
-    <w:bookmarkStart w:id="53" w:name="X008a0d0d765e1e01d7d1f1d7888a5c2cda07a0c"/>
+    <w:bookmarkEnd w:id="53"/>
+    <w:bookmarkStart w:id="55" w:name="X008a0d0d765e1e01d7d1f1d7888a5c2cda07a0c"/>
     <w:p>
       <w:pPr>
         <w:pStyle w:val="Heading1"/>
@@ -4517,7 +5318,7 @@
         <w:t xml:space="preserve">These aren’t self-made entrepreneurs who struck it rich. These are dynasties that have maintained power across centuries. That intermarry to preserve the bloodlines. That operate through networks invisible to ordinary observation.</w:t>
       </w:r>
     </w:p>
-    <w:bookmarkStart w:id="52" w:name="the-curious-timing-of-their-emergence"/>
+    <w:bookmarkStart w:id="54" w:name="the-curious-timing-of-their-emergence"/>
     <w:p>
       <w:pPr>
         <w:pStyle w:val="Heading2"/>
@@ -4762,9 +5563,9 @@
         </w:pict>
       </w:r>
     </w:p>
-    <w:bookmarkEnd w:id="52"/>
-    <w:bookmarkEnd w:id="53"/>
-    <w:bookmarkStart w:id="55" w:name="chapter-12-the-council-of-the-cast-out"/>
+    <w:bookmarkEnd w:id="54"/>
+    <w:bookmarkEnd w:id="55"/>
+    <w:bookmarkStart w:id="57" w:name="chapter-12-the-council-of-the-cast-out"/>
     <w:p>
       <w:pPr>
         <w:pStyle w:val="Heading1"/>
@@ -4813,7 +5614,7 @@
         <w:t xml:space="preserve">The council of the fallen mirrors the divine council of heaven. The bloodline families mirror the tribes of Israel. The Beast system mirrors the Kingdom of Yahuah.</w:t>
       </w:r>
     </w:p>
-    <w:bookmarkStart w:id="54" w:name="astana-the-council-made-visible"/>
+    <w:bookmarkStart w:id="56" w:name="astana-the-council-made-visible"/>
     <w:p>
       <w:pPr>
         <w:pStyle w:val="Heading2"/>
@@ -4943,9 +5744,9 @@
         </w:pict>
       </w:r>
     </w:p>
-    <w:bookmarkEnd w:id="54"/>
-    <w:bookmarkEnd w:id="55"/>
-    <w:bookmarkStart w:id="56" w:name="Xcde9a6b17e6a528c839b3b5f684ea1d2477460c"/>
+    <w:bookmarkEnd w:id="56"/>
+    <w:bookmarkEnd w:id="57"/>
+    <w:bookmarkStart w:id="58" w:name="Xcde9a6b17e6a528c839b3b5f684ea1d2477460c"/>
     <w:p>
       <w:pPr>
         <w:pStyle w:val="Heading1"/>
@@ -5035,8 +5836,8 @@
         </w:pict>
       </w:r>
     </w:p>
-    <w:bookmarkEnd w:id="56"/>
-    <w:bookmarkStart w:id="57" w:name="Xa4e95c7f313af35c7c0ad17b1ee9a5c3006b191"/>
+    <w:bookmarkEnd w:id="58"/>
+    <w:bookmarkStart w:id="59" w:name="Xa4e95c7f313af35c7c0ad17b1ee9a5c3006b191"/>
     <w:p>
       <w:pPr>
         <w:pStyle w:val="Heading1"/>
@@ -5052,8 +5853,8 @@
         </w:pict>
       </w:r>
     </w:p>
-    <w:bookmarkEnd w:id="57"/>
-    <w:bookmarkStart w:id="68" w:name="X6d597257b6500a7f554405cd35b39ce0cb5e7a5"/>
+    <w:bookmarkEnd w:id="59"/>
+    <w:bookmarkStart w:id="70" w:name="X6d597257b6500a7f554405cd35b39ce0cb5e7a5"/>
     <w:p>
       <w:pPr>
         <w:pStyle w:val="Heading1"/>
@@ -5078,7 +5879,7 @@
         <w:t xml:space="preserve">Enter Constantine.</w:t>
       </w:r>
     </w:p>
-    <w:bookmarkStart w:id="58" w:name="the-strategic-merger-312-325-ad"/>
+    <w:bookmarkStart w:id="60" w:name="the-strategic-merger-312-325-ad"/>
     <w:p>
       <w:pPr>
         <w:pStyle w:val="Heading2"/>
@@ -5150,8 +5951,8 @@
         <w:t xml:space="preserve">.</w:t>
       </w:r>
     </w:p>
-    <w:bookmarkEnd w:id="58"/>
-    <w:bookmarkStart w:id="59" w:name="the-edict-of-milan-313-ad"/>
+    <w:bookmarkEnd w:id="60"/>
+    <w:bookmarkStart w:id="61" w:name="the-edict-of-milan-313-ad"/>
     <w:p>
       <w:pPr>
         <w:pStyle w:val="Heading2"/>
@@ -5248,8 +6049,8 @@
         <w:t xml:space="preserve">: The early believers kept the seventh-day Sabbath (Friday sunset to Saturday sunset), as commanded in scripture. Constantine would change this.</w:t>
       </w:r>
     </w:p>
-    <w:bookmarkEnd w:id="59"/>
-    <w:bookmarkStart w:id="60" w:name="constantines-sunday-law-321-ad"/>
+    <w:bookmarkEnd w:id="61"/>
+    <w:bookmarkStart w:id="62" w:name="constantines-sunday-law-321-ad"/>
     <w:p>
       <w:pPr>
         <w:pStyle w:val="Heading2"/>
@@ -5392,8 +6193,8 @@
         <w:t xml:space="preserve">It was pure imperial decree.</w:t>
       </w:r>
     </w:p>
-    <w:bookmarkEnd w:id="60"/>
-    <w:bookmarkStart w:id="64" w:name="the-council-of-nicaea-325-ad"/>
+    <w:bookmarkEnd w:id="62"/>
+    <w:bookmarkStart w:id="66" w:name="the-council-of-nicaea-325-ad"/>
     <w:p>
       <w:pPr>
         <w:pStyle w:val="Heading2"/>
@@ -5418,7 +6219,7 @@
         <w:t xml:space="preserve">What the Council established:</w:t>
       </w:r>
     </w:p>
-    <w:bookmarkStart w:id="61" w:name="the-trinity-doctrine"/>
+    <w:bookmarkStart w:id="63" w:name="the-trinity-doctrine"/>
     <w:p>
       <w:pPr>
         <w:pStyle w:val="Heading3"/>
@@ -5523,8 +6324,8 @@
         <w:t xml:space="preserve">The pattern was already established in paganism. Constantine’s council simply gave it Christian names.</w:t>
       </w:r>
     </w:p>
-    <w:bookmarkEnd w:id="61"/>
-    <w:bookmarkStart w:id="62" w:name="the-nicene-creed"/>
+    <w:bookmarkEnd w:id="63"/>
+    <w:bookmarkStart w:id="64" w:name="the-nicene-creed"/>
     <w:p>
       <w:pPr>
         <w:pStyle w:val="Heading3"/>
@@ -5549,8 +6350,8 @@
         <w:t xml:space="preserve">This was not about truth. This was about control. One version became official. Alternatives were eliminated. Books were burned. Dissenters were exiled or executed.</w:t>
       </w:r>
     </w:p>
-    <w:bookmarkEnd w:id="62"/>
-    <w:bookmarkStart w:id="63" w:name="the-date-of-easter"/>
+    <w:bookmarkEnd w:id="64"/>
+    <w:bookmarkStart w:id="65" w:name="the-date-of-easter"/>
     <w:p>
       <w:pPr>
         <w:pStyle w:val="Heading3"/>
@@ -5567,9 +6368,9 @@
         <w:t xml:space="preserve">The Council also standardized the date of Easter - deliberately separating it from the Hebrew Passover that Yahusha actually observed. The timing was aligned with spring fertility celebrations, not with the biblical feast.</w:t>
       </w:r>
     </w:p>
-    <w:bookmarkEnd w:id="63"/>
-    <w:bookmarkEnd w:id="64"/>
-    <w:bookmarkStart w:id="65" w:name="the-completion-of-the-substitution"/>
+    <w:bookmarkEnd w:id="65"/>
+    <w:bookmarkEnd w:id="66"/>
+    <w:bookmarkStart w:id="67" w:name="the-completion-of-the-substitution"/>
     <w:p>
       <w:pPr>
         <w:pStyle w:val="Heading2"/>
@@ -5839,8 +6640,8 @@
         <w:t xml:space="preserve">.</w:t>
       </w:r>
     </w:p>
-    <w:bookmarkEnd w:id="65"/>
-    <w:bookmarkStart w:id="66" w:name="the-dark-ages-begin"/>
+    <w:bookmarkEnd w:id="67"/>
+    <w:bookmarkStart w:id="68" w:name="the-dark-ages-begin"/>
     <w:p>
       <w:pPr>
         <w:pStyle w:val="Heading2"/>
@@ -5966,8 +6767,8 @@
         <w:t xml:space="preserve">the infrastructure of deception was already built.</w:t>
       </w:r>
     </w:p>
-    <w:bookmarkEnd w:id="66"/>
-    <w:bookmarkStart w:id="67" w:name="the-significance"/>
+    <w:bookmarkEnd w:id="68"/>
+    <w:bookmarkStart w:id="69" w:name="the-significance"/>
     <w:p>
       <w:pPr>
         <w:pStyle w:val="Heading2"/>
@@ -6096,9 +6897,9 @@
         </w:pict>
       </w:r>
     </w:p>
-    <w:bookmarkEnd w:id="67"/>
-    <w:bookmarkEnd w:id="68"/>
-    <w:bookmarkStart w:id="69" w:name="part-five-the-second-reset"/>
+    <w:bookmarkEnd w:id="69"/>
+    <w:bookmarkEnd w:id="70"/>
+    <w:bookmarkStart w:id="71" w:name="part-five-the-second-reset"/>
     <w:p>
       <w:pPr>
         <w:pStyle w:val="Heading1"/>
@@ -6114,8 +6915,8 @@
         </w:pict>
       </w:r>
     </w:p>
-    <w:bookmarkEnd w:id="69"/>
-    <w:bookmarkStart w:id="71" w:name="chapter-14-tartaria-and-the-mud-flood"/>
+    <w:bookmarkEnd w:id="71"/>
+    <w:bookmarkStart w:id="73" w:name="chapter-14-tartaria-and-the-mud-flood"/>
     <w:p>
       <w:pPr>
         <w:pStyle w:val="Heading1"/>
@@ -6238,7 +7039,7 @@
         <w:t xml:space="preserve">The World’s Fairs of the late 1800s become significant in this context. Massive, ornate structures supposedly built for temporary exhibitions, then demolished. What if they weren’t built for the fairs? What if they were pre-existing, displayed briefly, then destroyed to erase the evidence of who actually constructed them?</w:t>
       </w:r>
     </w:p>
-    <w:bookmarkStart w:id="70" w:name="the-convergence-of-erasure"/>
+    <w:bookmarkStart w:id="72" w:name="the-convergence-of-erasure"/>
     <w:p>
       <w:pPr>
         <w:pStyle w:val="Heading2"/>
@@ -6491,9 +7292,9 @@
         </w:pict>
       </w:r>
     </w:p>
-    <w:bookmarkEnd w:id="70"/>
-    <w:bookmarkEnd w:id="71"/>
-    <w:bookmarkStart w:id="72" w:name="chapter-15-the-petrified-giants"/>
+    <w:bookmarkEnd w:id="72"/>
+    <w:bookmarkEnd w:id="73"/>
+    <w:bookmarkStart w:id="74" w:name="chapter-15-the-petrified-giants"/>
     <w:p>
       <w:pPr>
         <w:pStyle w:val="Heading1"/>
@@ -6581,8 +7382,8 @@
         </w:pict>
       </w:r>
     </w:p>
-    <w:bookmarkEnd w:id="72"/>
-    <w:bookmarkStart w:id="73" w:name="X61575ace9fbadc3f8b16bef23047aa31dc417be"/>
+    <w:bookmarkEnd w:id="74"/>
+    <w:bookmarkStart w:id="75" w:name="X61575ace9fbadc3f8b16bef23047aa31dc417be"/>
     <w:p>
       <w:pPr>
         <w:pStyle w:val="Heading1"/>
@@ -6779,8 +7580,8 @@
         </w:pict>
       </w:r>
     </w:p>
-    <w:bookmarkEnd w:id="73"/>
-    <w:bookmarkStart w:id="74" w:name="Xfd6b049ef12190b1af92f3bdcb9d3252639f183"/>
+    <w:bookmarkEnd w:id="75"/>
+    <w:bookmarkStart w:id="76" w:name="Xfd6b049ef12190b1af92f3bdcb9d3252639f183"/>
     <w:p>
       <w:pPr>
         <w:pStyle w:val="Heading1"/>
@@ -6860,8 +7661,8 @@
         </w:pict>
       </w:r>
     </w:p>
-    <w:bookmarkEnd w:id="74"/>
-    <w:bookmarkStart w:id="75" w:name="part-six-the-great-substitution"/>
+    <w:bookmarkEnd w:id="76"/>
+    <w:bookmarkStart w:id="77" w:name="part-six-the-great-substitution"/>
     <w:p>
       <w:pPr>
         <w:pStyle w:val="Heading1"/>
@@ -6877,8 +7678,8 @@
         </w:pict>
       </w:r>
     </w:p>
-    <w:bookmarkEnd w:id="75"/>
-    <w:bookmarkStart w:id="76" w:name="chapter-18-the-name-that-was-erased"/>
+    <w:bookmarkEnd w:id="77"/>
+    <w:bookmarkStart w:id="79" w:name="chapter-18-the-name-that-was-erased"/>
     <w:p>
       <w:pPr>
         <w:pStyle w:val="Heading1"/>
@@ -7127,6 +7928,266 @@
       </w:pPr>
       <w:r>
         <w:t xml:space="preserve">When someone deliberately changes your name, it’s an act of power. It’s saying they get to define you. Recovering the original name is an act of resistance. Of honoring the one who gave it.</w:t>
+      </w:r>
+    </w:p>
+    <w:bookmarkStart w:id="78" w:name="authors-thoughts-2"/>
+    <w:p>
+      <w:pPr>
+        <w:pStyle w:val="Heading3"/>
+      </w:pPr>
+      <w:r>
+        <w:t xml:space="preserve">✦ AUTHOR’S THOUGHTS ✦</w:t>
+      </w:r>
+    </w:p>
+    <w:p>
+      <w:pPr>
+        <w:pStyle w:val="FirstParagraph"/>
+      </w:pPr>
+      <w:r>
+        <w:rPr>
+          <w:b/>
+          <w:bCs/>
+        </w:rPr>
+        <w:t xml:space="preserve">The Gematria Connection: 666 and 2368</w:t>
+      </w:r>
+    </w:p>
+    <w:p>
+      <w:pPr>
+        <w:pStyle w:val="BodyText"/>
+      </w:pPr>
+      <w:r>
+        <w:t xml:space="preserve">The Cepher showed that Revelation 13:18 contains Greek letters - χξς (chi xi stigma) - not the number 666. That’s their work. Here’s what I found when I looked deeper, and this is where it gets undeniable.</w:t>
+      </w:r>
+    </w:p>
+    <w:p>
+      <w:pPr>
+        <w:pStyle w:val="BodyText"/>
+      </w:pPr>
+      <w:r>
+        <w:t xml:space="preserve">Greek isopsephy (gematria) assigns numerical values to letters. The ancients used this extensively - it wasn’t mysticism, it was mathematics embedded in language. When we calculate the Greek name and title that billions call upon:</w:t>
+      </w:r>
+    </w:p>
+    <w:p>
+      <w:pPr>
+        <w:pStyle w:val="BlockText"/>
+      </w:pPr>
+      <w:r>
+        <w:rPr>
+          <w:b/>
+          <w:bCs/>
+        </w:rPr>
+        <w:t xml:space="preserve">Ἰησοῦς (Iesous/Jesus)</w:t>
+      </w:r>
+      <w:r>
+        <w:t xml:space="preserve"> </w:t>
+      </w:r>
+      <w:r>
+        <w:t xml:space="preserve">= 888</w:t>
+      </w:r>
+      <w:r>
+        <w:t xml:space="preserve"> </w:t>
+      </w:r>
+      <w:r>
+        <w:rPr>
+          <w:b/>
+          <w:bCs/>
+        </w:rPr>
+        <w:t xml:space="preserve">Χριστός (Christos/Christ)</w:t>
+      </w:r>
+      <w:r>
+        <w:t xml:space="preserve"> </w:t>
+      </w:r>
+      <w:r>
+        <w:t xml:space="preserve">= 1480</w:t>
+      </w:r>
+      <w:r>
+        <w:t xml:space="preserve"> </w:t>
+      </w:r>
+      <w:r>
+        <w:rPr>
+          <w:b/>
+          <w:bCs/>
+        </w:rPr>
+        <w:t xml:space="preserve">Ἰησοῦς Χριστός (Jesus Christ)</w:t>
+      </w:r>
+      <w:r>
+        <w:t xml:space="preserve"> </w:t>
+      </w:r>
+      <w:r>
+        <w:t xml:space="preserve">= 888 + 1480 =</w:t>
+      </w:r>
+      <w:r>
+        <w:t xml:space="preserve"> </w:t>
+      </w:r>
+      <w:r>
+        <w:rPr>
+          <w:b/>
+          <w:bCs/>
+        </w:rPr>
+        <w:t xml:space="preserve">2368</w:t>
+      </w:r>
+    </w:p>
+    <w:p>
+      <w:pPr>
+        <w:pStyle w:val="FirstParagraph"/>
+      </w:pPr>
+      <w:r>
+        <w:t xml:space="preserve">Now here is where the dots connect in a way that cannot be dismissed as coincidence. The complete Greek phrase from Revelation 13:18 -</w:t>
+      </w:r>
+      <w:r>
+        <w:t xml:space="preserve"> </w:t>
+      </w:r>
+      <w:r>
+        <w:rPr>
+          <w:b/>
+          <w:bCs/>
+        </w:rPr>
+        <w:t xml:space="preserve">“</w:t>
+      </w:r>
+      <w:r>
+        <w:rPr>
+          <w:b/>
+          <w:bCs/>
+        </w:rPr>
+        <w:t xml:space="preserve">καὶ ὁ ἀριθμὸς αὐτοῦ χξϛ</w:t>
+      </w:r>
+      <w:r>
+        <w:rPr>
+          <w:b/>
+          <w:bCs/>
+        </w:rPr>
+        <w:t xml:space="preserve">”</w:t>
+      </w:r>
+      <w:r>
+        <w:t xml:space="preserve"> </w:t>
+      </w:r>
+      <w:r>
+        <w:t xml:space="preserve">(and his number is chi xi stigma) - when calculated using the same exact method,</w:t>
+      </w:r>
+      <w:r>
+        <w:t xml:space="preserve"> </w:t>
+      </w:r>
+      <w:r>
+        <w:rPr>
+          <w:i/>
+          <w:iCs/>
+        </w:rPr>
+        <w:t xml:space="preserve">also equals 2368</w:t>
+      </w:r>
+      <w:r>
+        <w:t xml:space="preserve">. The exact same gematria value as</w:t>
+      </w:r>
+      <w:r>
+        <w:t xml:space="preserve"> </w:t>
+      </w:r>
+      <w:r>
+        <w:t xml:space="preserve">“</w:t>
+      </w:r>
+      <w:r>
+        <w:t xml:space="preserve">Jesus Christ.</w:t>
+      </w:r>
+      <w:r>
+        <w:t xml:space="preserve">”</w:t>
+      </w:r>
+    </w:p>
+    <w:p>
+      <w:pPr>
+        <w:pStyle w:val="BodyText"/>
+      </w:pPr>
+      <w:r>
+        <w:t xml:space="preserve">Stop and consider what this means. The passage that identifies the beast’s number - the very phrase itself - carries the same numerical signature as the name billions worship. This isn’t interpretation. It’s mathematics. Anyone can verify it.</w:t>
+      </w:r>
+    </w:p>
+    <w:p>
+      <w:pPr>
+        <w:pStyle w:val="BodyText"/>
+      </w:pPr>
+      <w:r>
+        <w:t xml:space="preserve">Now consider this alongside what Yahusha said in Yochanon (John) 5:43:</w:t>
+      </w:r>
+      <w:r>
+        <w:t xml:space="preserve"> </w:t>
+      </w:r>
+      <w:r>
+        <w:t xml:space="preserve">“</w:t>
+      </w:r>
+      <w:r>
+        <w:t xml:space="preserve">I am come in my Father’s name, and you receive me not: if another shall come in his own name, him you will receive.</w:t>
+      </w:r>
+      <w:r>
+        <w:t xml:space="preserve">”</w:t>
+      </w:r>
+    </w:p>
+    <w:p>
+      <w:pPr>
+        <w:pStyle w:val="BodyText"/>
+      </w:pPr>
+      <w:r>
+        <w:rPr>
+          <w:b/>
+          <w:bCs/>
+        </w:rPr>
+        <w:t xml:space="preserve">Yahusha</w:t>
+      </w:r>
+      <w:r>
+        <w:t xml:space="preserve"> </w:t>
+      </w:r>
+      <w:r>
+        <w:t xml:space="preserve">(יהושע) literally contains</w:t>
+      </w:r>
+      <w:r>
+        <w:t xml:space="preserve"> </w:t>
+      </w:r>
+      <w:r>
+        <w:rPr>
+          <w:b/>
+          <w:bCs/>
+        </w:rPr>
+        <w:t xml:space="preserve">Yahuah</w:t>
+      </w:r>
+      <w:r>
+        <w:t xml:space="preserve"> </w:t>
+      </w:r>
+      <w:r>
+        <w:t xml:space="preserve">(יהוה) - look at the letters. The Father’s name is embedded within the Son’s name. He came IN the Father’s name. The name itself carries the Father.</w:t>
+      </w:r>
+    </w:p>
+    <w:p>
+      <w:pPr>
+        <w:pStyle w:val="BodyText"/>
+      </w:pPr>
+      <w:r>
+        <w:t xml:space="preserve">But</w:t>
+      </w:r>
+      <w:r>
+        <w:t xml:space="preserve"> </w:t>
+      </w:r>
+      <w:r>
+        <w:t xml:space="preserve">“</w:t>
+      </w:r>
+      <w:r>
+        <w:t xml:space="preserve">Jesus</w:t>
+      </w:r>
+      <w:r>
+        <w:t xml:space="preserve">”</w:t>
+      </w:r>
+      <w:r>
+        <w:t xml:space="preserve"> </w:t>
+      </w:r>
+      <w:r>
+        <w:t xml:space="preserve">is a Romanized Greek translation that passed through Latin before reaching English. There is no connection to Yahuah whatsoever. The Father’s name has been completely removed. And billions call upon this name without ever knowing the original - or that removing the Father’s name might carry consequences.</w:t>
+      </w:r>
+    </w:p>
+    <w:p>
+      <w:pPr>
+        <w:pStyle w:val="BodyText"/>
+      </w:pPr>
+      <w:r>
+        <w:rPr>
+          <w:i/>
+          <w:iCs/>
+        </w:rPr>
+        <w:t xml:space="preserve">This isn’t about condemning anyone. It’s about asking: if names matter - if they carry meaning, authority, and allegiance - then what does it mean that the whole world calls upon a name stripped of the Father while the original remains hidden?</w:t>
       </w:r>
     </w:p>
     <w:p>
@@ -7136,8 +8197,9 @@
         </w:pict>
       </w:r>
     </w:p>
-    <w:bookmarkEnd w:id="76"/>
-    <w:bookmarkStart w:id="77" w:name="chapter-19-the-name-that-was-stolen"/>
+    <w:bookmarkEnd w:id="78"/>
+    <w:bookmarkEnd w:id="79"/>
+    <w:bookmarkStart w:id="80" w:name="chapter-19-the-name-that-was-stolen"/>
     <w:p>
       <w:pPr>
         <w:pStyle w:val="Heading1"/>
@@ -7739,8 +8801,8 @@
         </w:pict>
       </w:r>
     </w:p>
-    <w:bookmarkEnd w:id="77"/>
-    <w:bookmarkStart w:id="78" w:name="chapter-19b-the-continuous-deception"/>
+    <w:bookmarkEnd w:id="80"/>
+    <w:bookmarkStart w:id="81" w:name="chapter-19b-the-continuous-deception"/>
     <w:p>
       <w:pPr>
         <w:pStyle w:val="Heading1"/>
@@ -8448,8 +9510,8 @@
         </w:pict>
       </w:r>
     </w:p>
-    <w:bookmarkEnd w:id="78"/>
-    <w:bookmarkStart w:id="79" w:name="chapter-20-the-king-james-corruption"/>
+    <w:bookmarkEnd w:id="81"/>
+    <w:bookmarkStart w:id="82" w:name="chapter-20-the-king-james-corruption"/>
     <w:p>
       <w:pPr>
         <w:pStyle w:val="Heading1"/>
@@ -8521,8 +9583,8 @@
         </w:pict>
       </w:r>
     </w:p>
-    <w:bookmarkEnd w:id="79"/>
-    <w:bookmarkStart w:id="95" w:name="X5b6c1e6457f782fe51ac25c3b388cd53cda2121"/>
+    <w:bookmarkEnd w:id="82"/>
+    <w:bookmarkStart w:id="98" w:name="X5b6c1e6457f782fe51ac25c3b388cd53cda2121"/>
     <w:p>
       <w:pPr>
         <w:pStyle w:val="Heading1"/>
@@ -8793,7 +9855,7 @@
         <w:t xml:space="preserve">The denigration of what’s important. And ultimately, the control agenda in the destruction of spirituality. The real spirituality. The real connection.</w:t>
       </w:r>
     </w:p>
-    <w:bookmarkStart w:id="80" w:name="the-stake-not-the-cross"/>
+    <w:bookmarkStart w:id="83" w:name="the-stake-not-the-cross"/>
     <w:p>
       <w:pPr>
         <w:pStyle w:val="Heading2"/>
@@ -8934,8 +9996,8 @@
         <w:t xml:space="preserve">The substitution is complete. The symbol of torture became the symbol of faith.</w:t>
       </w:r>
     </w:p>
-    <w:bookmarkEnd w:id="80"/>
-    <w:bookmarkStart w:id="81" w:name="the-trinity---not-in-scripture"/>
+    <w:bookmarkEnd w:id="83"/>
+    <w:bookmarkStart w:id="84" w:name="the-trinity---not-in-scripture"/>
     <w:p>
       <w:pPr>
         <w:pStyle w:val="Heading2"/>
@@ -9042,8 +10104,8 @@
         <w:t xml:space="preserve">The Ruach Ha’Qodesh (Set-Apart Spirit) is the breath, the power, the presence of Yahuah - not a separate person of a triune godhead. This distinction was manufactured centuries later to create a doctrine that required institutional interpretation.</w:t>
       </w:r>
     </w:p>
-    <w:bookmarkEnd w:id="81"/>
-    <w:bookmarkStart w:id="82" w:name="the-rapture---where-is-it"/>
+    <w:bookmarkEnd w:id="84"/>
+    <w:bookmarkStart w:id="85" w:name="the-rapture---where-is-it"/>
     <w:p>
       <w:pPr>
         <w:pStyle w:val="Heading2"/>
@@ -9178,8 +10240,8 @@
         <w:t xml:space="preserve">But if we’ve already passed the thousand-year reign and are now in Satan’s little season, the question becomes moot. There is no future tribulation to escape. The tribulation is the world we’re living in.</w:t>
       </w:r>
     </w:p>
-    <w:bookmarkEnd w:id="82"/>
-    <w:bookmarkStart w:id="83" w:name="X56e1d100a85482820da780ea8910c73aeeff710"/>
+    <w:bookmarkEnd w:id="85"/>
+    <w:bookmarkStart w:id="86" w:name="X56e1d100a85482820da780ea8910c73aeeff710"/>
     <w:p>
       <w:pPr>
         <w:pStyle w:val="Heading2"/>
@@ -9414,8 +10476,8 @@
         <w:t xml:space="preserve">Yahuah is not a torturer. He is righteous. He is just. And justice does not require infinite punishment for finite sins. It requires the removal of evil from existence.</w:t>
       </w:r>
     </w:p>
-    <w:bookmarkEnd w:id="83"/>
-    <w:bookmarkStart w:id="84" w:name="why-the-fallen-push-toward-destruction"/>
+    <w:bookmarkEnd w:id="86"/>
+    <w:bookmarkStart w:id="87" w:name="why-the-fallen-push-toward-destruction"/>
     <w:p>
       <w:pPr>
         <w:pStyle w:val="Heading2"/>
@@ -9525,8 +10587,8 @@
         </w:pict>
       </w:r>
     </w:p>
-    <w:bookmarkEnd w:id="84"/>
-    <w:bookmarkStart w:id="85" w:name="the-scripture-that-shouldnt-exist"/>
+    <w:bookmarkEnd w:id="87"/>
+    <w:bookmarkStart w:id="88" w:name="the-scripture-that-shouldnt-exist"/>
     <w:p>
       <w:pPr>
         <w:pStyle w:val="Heading2"/>
@@ -9617,8 +10679,8 @@
         <w:t xml:space="preserve">This is the evidence skeptics dismiss. Not because it lacks merit, but because accepting it requires accepting what follows.</w:t>
       </w:r>
     </w:p>
-    <w:bookmarkEnd w:id="85"/>
-    <w:bookmarkStart w:id="86" w:name="the-books-they-removed"/>
+    <w:bookmarkEnd w:id="88"/>
+    <w:bookmarkStart w:id="89" w:name="the-books-they-removed"/>
     <w:p>
       <w:pPr>
         <w:pStyle w:val="Heading2"/>
@@ -9840,8 +10902,8 @@
         </w:pict>
       </w:r>
     </w:p>
-    <w:bookmarkEnd w:id="86"/>
-    <w:bookmarkStart w:id="94" w:name="the-fracturing-of-scripture-a-comparison"/>
+    <w:bookmarkEnd w:id="89"/>
+    <w:bookmarkStart w:id="97" w:name="the-fracturing-of-scripture-a-comparison"/>
     <w:p>
       <w:pPr>
         <w:pStyle w:val="Heading2"/>
@@ -9884,7 +10946,7 @@
         <w:t xml:space="preserve">Here’s what happened to the Word as it passed through human hands and institutional agendas:</w:t>
       </w:r>
     </w:p>
-    <w:bookmarkStart w:id="87" w:name="book-count-comparison"/>
+    <w:bookmarkStart w:id="90" w:name="book-count-comparison"/>
     <w:p>
       <w:pPr>
         <w:pStyle w:val="Heading3"/>
@@ -10317,8 +11379,8 @@
         <w:t xml:space="preserve">”</w:t>
       </w:r>
     </w:p>
-    <w:bookmarkEnd w:id="87"/>
-    <w:bookmarkStart w:id="88" w:name="the-name-substitutions"/>
+    <w:bookmarkEnd w:id="90"/>
+    <w:bookmarkStart w:id="91" w:name="the-name-substitutions"/>
     <w:p>
       <w:pPr>
         <w:pStyle w:val="Heading3"/>
@@ -10781,8 +11843,8 @@
         </w:tc>
       </w:tr>
     </w:tbl>
-    <w:bookmarkEnd w:id="88"/>
-    <w:bookmarkStart w:id="89" w:name="Xd46e84799a66e68d0edcc7cf7bc5c7f01ec11db"/>
+    <w:bookmarkEnd w:id="91"/>
+    <w:bookmarkStart w:id="92" w:name="Xd46e84799a66e68d0edcc7cf7bc5c7f01ec11db"/>
     <w:p>
       <w:pPr>
         <w:pStyle w:val="Heading3"/>
@@ -11582,8 +12644,8 @@
         </w:pict>
       </w:r>
     </w:p>
-    <w:bookmarkEnd w:id="89"/>
-    <w:bookmarkStart w:id="90" w:name="X70c0ead059773d83a2131dd40364499abf735bc"/>
+    <w:bookmarkEnd w:id="92"/>
+    <w:bookmarkStart w:id="93" w:name="X70c0ead059773d83a2131dd40364499abf735bc"/>
     <w:p>
       <w:pPr>
         <w:pStyle w:val="Heading3"/>
@@ -11912,8 +12974,8 @@
         <w:t xml:space="preserve">- you’re using a title that could refer to anyone. When you call on Yahuah - you’re using His actual Name. The one He gave. The one with power. The one they removed.</w:t>
       </w:r>
     </w:p>
-    <w:bookmarkEnd w:id="90"/>
-    <w:bookmarkStart w:id="91" w:name="key-verse-comparisons"/>
+    <w:bookmarkEnd w:id="93"/>
+    <w:bookmarkStart w:id="94" w:name="key-verse-comparisons"/>
     <w:p>
       <w:pPr>
         <w:pStyle w:val="Heading3"/>
@@ -12221,8 +13283,8 @@
         <w:t xml:space="preserve">The explicit confession that Yahusha is the Son of Elohiym - removed from modern translations.</w:t>
       </w:r>
     </w:p>
-    <w:bookmarkEnd w:id="91"/>
-    <w:bookmarkStart w:id="92" w:name="the-denominational-fracturing"/>
+    <w:bookmarkEnd w:id="94"/>
+    <w:bookmarkStart w:id="95" w:name="the-denominational-fracturing"/>
     <w:p>
       <w:pPr>
         <w:pStyle w:val="Heading3"/>
@@ -12271,8 +13333,8 @@
         <w:t xml:space="preserve">Divide and conquer. It works on nations. It works on religions. It works on families.</w:t>
       </w:r>
     </w:p>
-    <w:bookmarkEnd w:id="92"/>
-    <w:bookmarkStart w:id="93" w:name="the-frequency-connection"/>
+    <w:bookmarkEnd w:id="95"/>
+    <w:bookmarkStart w:id="96" w:name="the-frequency-connection"/>
     <w:p>
       <w:pPr>
         <w:pStyle w:val="Heading3"/>
@@ -12406,10 +13468,10 @@
         </w:pict>
       </w:r>
     </w:p>
-    <w:bookmarkEnd w:id="93"/>
-    <w:bookmarkEnd w:id="94"/>
-    <w:bookmarkEnd w:id="95"/>
-    <w:bookmarkStart w:id="97" w:name="chapter-22-the-substituted-calendar"/>
+    <w:bookmarkEnd w:id="96"/>
+    <w:bookmarkEnd w:id="97"/>
+    <w:bookmarkEnd w:id="98"/>
+    <w:bookmarkStart w:id="100" w:name="chapter-22-the-substituted-calendar"/>
     <w:p>
       <w:pPr>
         <w:pStyle w:val="Heading1"/>
@@ -12510,7 +13572,7 @@
         <w:t xml:space="preserve">But Christianity observes Sunday. The first day. The day of the sun god.</w:t>
       </w:r>
     </w:p>
-    <w:bookmarkStart w:id="96" w:name="the-edict-of-constantine"/>
+    <w:bookmarkStart w:id="99" w:name="the-edict-of-constantine"/>
     <w:p>
       <w:pPr>
         <w:pStyle w:val="Heading2"/>
@@ -12724,9 +13786,9 @@
         </w:pict>
       </w:r>
     </w:p>
-    <w:bookmarkEnd w:id="96"/>
-    <w:bookmarkEnd w:id="97"/>
-    <w:bookmarkStart w:id="98" w:name="part-seven-the-systems-of-control"/>
+    <w:bookmarkEnd w:id="99"/>
+    <w:bookmarkEnd w:id="100"/>
+    <w:bookmarkStart w:id="101" w:name="part-seven-the-systems-of-control"/>
     <w:p>
       <w:pPr>
         <w:pStyle w:val="Heading1"/>
@@ -12742,8 +13804,8 @@
         </w:pict>
       </w:r>
     </w:p>
-    <w:bookmarkEnd w:id="98"/>
-    <w:bookmarkStart w:id="99" w:name="Xf9afb3bd55c25f5ff0f01d9846458c3bc17fdeb"/>
+    <w:bookmarkEnd w:id="101"/>
+    <w:bookmarkStart w:id="102" w:name="Xf9afb3bd55c25f5ff0f01d9846458c3bc17fdeb"/>
     <w:p>
       <w:pPr>
         <w:pStyle w:val="Heading1"/>
@@ -12859,8 +13921,8 @@
         </w:pict>
       </w:r>
     </w:p>
-    <w:bookmarkEnd w:id="99"/>
-    <w:bookmarkStart w:id="100" w:name="chapter-24-the-indoctrination-machine"/>
+    <w:bookmarkEnd w:id="102"/>
+    <w:bookmarkStart w:id="103" w:name="chapter-24-the-indoctrination-machine"/>
     <w:p>
       <w:pPr>
         <w:pStyle w:val="Heading1"/>
@@ -12964,8 +14026,8 @@
         </w:pict>
       </w:r>
     </w:p>
-    <w:bookmarkEnd w:id="100"/>
-    <w:bookmarkStart w:id="101" w:name="chapter-25-economics-and-the-worker-bees"/>
+    <w:bookmarkEnd w:id="103"/>
+    <w:bookmarkStart w:id="104" w:name="chapter-25-economics-and-the-worker-bees"/>
     <w:p>
       <w:pPr>
         <w:pStyle w:val="Heading1"/>
@@ -13095,8 +14157,8 @@
         </w:pict>
       </w:r>
     </w:p>
-    <w:bookmarkEnd w:id="101"/>
-    <w:bookmarkStart w:id="102" w:name="Xc71a8d813f8ef680e1b21e9f4f2b90b546d45ae"/>
+    <w:bookmarkEnd w:id="104"/>
+    <w:bookmarkStart w:id="105" w:name="Xc71a8d813f8ef680e1b21e9f4f2b90b546d45ae"/>
     <w:p>
       <w:pPr>
         <w:pStyle w:val="Heading1"/>
@@ -13700,8 +14762,8 @@
         </w:pict>
       </w:r>
     </w:p>
-    <w:bookmarkEnd w:id="102"/>
-    <w:bookmarkStart w:id="109" w:name="X6b0faa5ae7f4ad6de6646c11e492ce008909953"/>
+    <w:bookmarkEnd w:id="105"/>
+    <w:bookmarkStart w:id="113" w:name="X6b0faa5ae7f4ad6de6646c11e492ce008909953"/>
     <w:p>
       <w:pPr>
         <w:pStyle w:val="Heading1"/>
@@ -13802,7 +14864,7 @@
         <w:t xml:space="preserve">: Offers escape from reality while programming perception. Uses storytelling to normalize agendas. Creates celebrity worship as substitute religion. Substitutes meaning with distraction.</w:t>
       </w:r>
     </w:p>
-    <w:bookmarkStart w:id="103" w:name="hollywood-and-the-stars"/>
+    <w:bookmarkStart w:id="106" w:name="hollywood-and-the-stars"/>
     <w:p>
       <w:pPr>
         <w:pStyle w:val="Heading2"/>
@@ -14003,8 +15065,8 @@
         <w:t xml:space="preserve">The stars fell. And now they’re worshipped again - on screens in every home, on stages before millions, in the dreams of children who want to be just like them.</w:t>
       </w:r>
     </w:p>
-    <w:bookmarkEnd w:id="103"/>
-    <w:bookmarkStart w:id="104" w:name="the-27-club-and-luciferian-numerology"/>
+    <w:bookmarkEnd w:id="106"/>
+    <w:bookmarkStart w:id="107" w:name="the-27-club-and-luciferian-numerology"/>
     <w:p>
       <w:pPr>
         <w:pStyle w:val="Heading2"/>
@@ -14123,8 +15185,8 @@
         <w:t xml:space="preserve">They’re not hiding it. They’re flaunting it.</w:t>
       </w:r>
     </w:p>
-    <w:bookmarkEnd w:id="104"/>
-    <w:bookmarkStart w:id="105" w:name="they-put-it-in-your-face"/>
+    <w:bookmarkEnd w:id="107"/>
+    <w:bookmarkStart w:id="108" w:name="they-put-it-in-your-face"/>
     <w:p>
       <w:pPr>
         <w:pStyle w:val="Heading2"/>
@@ -14249,8 +15311,8 @@
         <w:t xml:space="preserve">becomes the thought-terminating cliche. The fiction inoculates against recognizing the fact.</w:t>
       </w:r>
     </w:p>
-    <w:bookmarkEnd w:id="105"/>
-    <w:bookmarkStart w:id="106" w:name="the-mockery-in-plain-sight"/>
+    <w:bookmarkEnd w:id="108"/>
+    <w:bookmarkStart w:id="109" w:name="the-mockery-in-plain-sight"/>
     <w:p>
       <w:pPr>
         <w:pStyle w:val="Heading2"/>
@@ -14435,8 +15497,8 @@
         <w:t xml:space="preserve">”</w:t>
       </w:r>
     </w:p>
-    <w:bookmarkEnd w:id="106"/>
-    <w:bookmarkStart w:id="107" w:name="corporate-logos-tell-the-story"/>
+    <w:bookmarkEnd w:id="109"/>
+    <w:bookmarkStart w:id="110" w:name="corporate-logos-tell-the-story"/>
     <w:p>
       <w:pPr>
         <w:pStyle w:val="Heading2"/>
@@ -14631,8 +15693,8 @@
         <w:t xml:space="preserve">But once you see the pattern, you can’t unsee it. The symbols are everywhere. The numbers repeat. The themes recur. And the agenda advances while everyone thinks they’re just watching a show.</w:t>
       </w:r>
     </w:p>
-    <w:bookmarkEnd w:id="107"/>
-    <w:bookmarkStart w:id="108" w:name="the-narrow-truth"/>
+    <w:bookmarkEnd w:id="110"/>
+    <w:bookmarkStart w:id="112" w:name="the-narrow-truth"/>
     <w:p>
       <w:pPr>
         <w:pStyle w:val="Heading2"/>
@@ -14997,6 +16059,210 @@
         <w:t xml:space="preserve">This is the Beast system. It’s not just about Rome or empires of old. It’s a global, spiritual infrastructure that has co-opted language, faith, and identity to redirect worship, sever connection, and sell a counterfeit messiah.</w:t>
       </w:r>
     </w:p>
+    <w:bookmarkStart w:id="111" w:name="authors-thoughts-3"/>
+    <w:p>
+      <w:pPr>
+        <w:pStyle w:val="Heading3"/>
+      </w:pPr>
+      <w:r>
+        <w:t xml:space="preserve">✦ AUTHOR’S THOUGHTS ✦</w:t>
+      </w:r>
+    </w:p>
+    <w:p>
+      <w:pPr>
+        <w:pStyle w:val="FirstParagraph"/>
+      </w:pPr>
+      <w:r>
+        <w:rPr>
+          <w:b/>
+          <w:bCs/>
+        </w:rPr>
+        <w:t xml:space="preserve">The Spiritual Mark</w:t>
+      </w:r>
+    </w:p>
+    <w:p>
+      <w:pPr>
+        <w:pStyle w:val="BodyText"/>
+      </w:pPr>
+      <w:r>
+        <w:t xml:space="preserve">While many focus on a physical manifestation - a chip, a tattoo, a barcode - consider the deeper meaning of the forehead and hand. Scripture uses this same language in Devariym (Deuteronomy) 6:8 regarding the Torah:</w:t>
+      </w:r>
+      <w:r>
+        <w:t xml:space="preserve"> </w:t>
+      </w:r>
+      <w:r>
+        <w:t xml:space="preserve">“</w:t>
+      </w:r>
+      <w:r>
+        <w:t xml:space="preserve">And thou shalt bind them for a sign upon thine hand, and they shall be as frontlets between thine eyes.</w:t>
+      </w:r>
+      <w:r>
+        <w:t xml:space="preserve">”</w:t>
+      </w:r>
+    </w:p>
+    <w:p>
+      <w:pPr>
+        <w:pStyle w:val="BodyText"/>
+      </w:pPr>
+      <w:r>
+        <w:t xml:space="preserve">The</w:t>
+      </w:r>
+      <w:r>
+        <w:t xml:space="preserve"> </w:t>
+      </w:r>
+      <w:r>
+        <w:rPr>
+          <w:b/>
+          <w:bCs/>
+        </w:rPr>
+        <w:t xml:space="preserve">forehead</w:t>
+      </w:r>
+      <w:r>
+        <w:t xml:space="preserve"> </w:t>
+      </w:r>
+      <w:r>
+        <w:t xml:space="preserve">represents the mind - what you believe, who you acknowledge as authority, where your signal comes in. The</w:t>
+      </w:r>
+      <w:r>
+        <w:t xml:space="preserve"> </w:t>
+      </w:r>
+      <w:r>
+        <w:rPr>
+          <w:b/>
+          <w:bCs/>
+        </w:rPr>
+        <w:t xml:space="preserve">hand</w:t>
+      </w:r>
+      <w:r>
+        <w:t xml:space="preserve"> </w:t>
+      </w:r>
+      <w:r>
+        <w:t xml:space="preserve">represents your works - what you labor for, what you build, whom you serve with your actions. The mark of Yahuah or the mark of the beast is first and foremost a matter of</w:t>
+      </w:r>
+      <w:r>
+        <w:t xml:space="preserve"> </w:t>
+      </w:r>
+      <w:r>
+        <w:rPr>
+          <w:b/>
+          <w:bCs/>
+        </w:rPr>
+        <w:t xml:space="preserve">allegiance</w:t>
+      </w:r>
+      <w:r>
+        <w:t xml:space="preserve">.</w:t>
+      </w:r>
+    </w:p>
+    <w:p>
+      <w:pPr>
+        <w:pStyle w:val="BodyText"/>
+      </w:pPr>
+      <w:r>
+        <w:t xml:space="preserve">If a physical mark is required to</w:t>
+      </w:r>
+      <w:r>
+        <w:t xml:space="preserve"> </w:t>
+      </w:r>
+      <w:r>
+        <w:t xml:space="preserve">“</w:t>
+      </w:r>
+      <w:r>
+        <w:t xml:space="preserve">buy or sell,</w:t>
+      </w:r>
+      <w:r>
+        <w:t xml:space="preserve">”</w:t>
+      </w:r>
+      <w:r>
+        <w:t xml:space="preserve"> </w:t>
+      </w:r>
+      <w:r>
+        <w:t xml:space="preserve">it may simply be the outward confirmation of a spiritual decision already made. You will not be forced. You will choose. And that choice may have already been made through acceptance of false doctrine in the mind (forehead) and participation in false worship with the body (hand).</w:t>
+      </w:r>
+    </w:p>
+    <w:p>
+      <w:pPr>
+        <w:pStyle w:val="BodyText"/>
+      </w:pPr>
+      <w:r>
+        <w:rPr>
+          <w:b/>
+          <w:bCs/>
+        </w:rPr>
+        <w:t xml:space="preserve">The Symbolism Everywhere</w:t>
+      </w:r>
+    </w:p>
+    <w:p>
+      <w:pPr>
+        <w:pStyle w:val="BodyText"/>
+      </w:pPr>
+      <w:r>
+        <w:t xml:space="preserve">The chi xi stigma imagery appears constantly in modern branding, architecture, hand signs, and corporate logos - often disguised but recognizable once you know what to look for.</w:t>
+      </w:r>
+    </w:p>
+    <w:p>
+      <w:pPr>
+        <w:pStyle w:val="BodyText"/>
+      </w:pPr>
+      <w:r>
+        <w:t xml:space="preserve">Consider the Monster Energy drink logo - three claw marks that form the Hebrew letter</w:t>
+      </w:r>
+      <w:r>
+        <w:t xml:space="preserve"> </w:t>
+      </w:r>
+      <w:r>
+        <w:t xml:space="preserve">“</w:t>
+      </w:r>
+      <w:r>
+        <w:t xml:space="preserve">vav</w:t>
+      </w:r>
+      <w:r>
+        <w:t xml:space="preserve">”</w:t>
+      </w:r>
+      <w:r>
+        <w:t xml:space="preserve"> </w:t>
+      </w:r>
+      <w:r>
+        <w:t xml:space="preserve">(ו) repeated three times. Vav has a numerical value of 6. Three vavs: 666. Hidden in plain sight on millions of cans.</w:t>
+      </w:r>
+    </w:p>
+    <w:p>
+      <w:pPr>
+        <w:pStyle w:val="BodyText"/>
+      </w:pPr>
+      <w:r>
+        <w:t xml:space="preserve">Observe the hand sign made by countless celebrities - thumb and index finger forming a circle with three fingers extended. It creates 666. Some dismiss this as coincidence or the</w:t>
+      </w:r>
+      <w:r>
+        <w:t xml:space="preserve"> </w:t>
+      </w:r>
+      <w:r>
+        <w:t xml:space="preserve">“</w:t>
+      </w:r>
+      <w:r>
+        <w:t xml:space="preserve">OK</w:t>
+      </w:r>
+      <w:r>
+        <w:t xml:space="preserve">”</w:t>
+      </w:r>
+      <w:r>
+        <w:t xml:space="preserve"> </w:t>
+      </w:r>
+      <w:r>
+        <w:t xml:space="preserve">sign. But when the same gesture appears across industries, nationalities, and decades, coincidence strains credulity.</w:t>
+      </w:r>
+    </w:p>
+    <w:p>
+      <w:pPr>
+        <w:pStyle w:val="BodyText"/>
+      </w:pPr>
+      <w:r>
+        <w:rPr>
+          <w:i/>
+          <w:iCs/>
+        </w:rPr>
+        <w:t xml:space="preserve">Corporate emblems from technology giants display circular patterns that, upon inspection, contain interlocking sixes. These are the companies that seemingly control everything - information, communication, commerce. Why would they encode this symbolism unless it meant something?</w:t>
+      </w:r>
+    </w:p>
     <w:p>
       <w:pPr>
         <w:pStyle w:val="BodyText"/>
@@ -15824,9 +17090,10 @@
         </w:pict>
       </w:r>
     </w:p>
-    <w:bookmarkEnd w:id="108"/>
-    <w:bookmarkEnd w:id="109"/>
-    <w:bookmarkStart w:id="110" w:name="part-eight-the-war-on-perception"/>
+    <w:bookmarkEnd w:id="111"/>
+    <w:bookmarkEnd w:id="112"/>
+    <w:bookmarkEnd w:id="113"/>
+    <w:bookmarkStart w:id="114" w:name="part-eight-the-war-on-perception"/>
     <w:p>
       <w:pPr>
         <w:pStyle w:val="Heading1"/>
@@ -15842,8 +17109,8 @@
         </w:pict>
       </w:r>
     </w:p>
-    <w:bookmarkEnd w:id="110"/>
-    <w:bookmarkStart w:id="111" w:name="X7cf3b00ba186fbaaf7891f5139c777153e08e5e"/>
+    <w:bookmarkEnd w:id="114"/>
+    <w:bookmarkStart w:id="115" w:name="X7cf3b00ba186fbaaf7891f5139c777153e08e5e"/>
     <w:p>
       <w:pPr>
         <w:pStyle w:val="Heading1"/>
@@ -16716,8 +17983,8 @@
         </w:pict>
       </w:r>
     </w:p>
-    <w:bookmarkEnd w:id="111"/>
-    <w:bookmarkStart w:id="112" w:name="X65e31b423f09cf5a018737610d660ceb4871bf8"/>
+    <w:bookmarkEnd w:id="115"/>
+    <w:bookmarkStart w:id="116" w:name="X65e31b423f09cf5a018737610d660ceb4871bf8"/>
     <w:p>
       <w:pPr>
         <w:pStyle w:val="Heading1"/>
@@ -18264,8 +19531,8 @@
         </w:pict>
       </w:r>
     </w:p>
-    <w:bookmarkEnd w:id="112"/>
-    <w:bookmarkStart w:id="113" w:name="X1cd0a854ef134cce0bf9a3fb630452a908d09be"/>
+    <w:bookmarkEnd w:id="116"/>
+    <w:bookmarkStart w:id="117" w:name="X1cd0a854ef134cce0bf9a3fb630452a908d09be"/>
     <w:p>
       <w:pPr>
         <w:pStyle w:val="Heading1"/>
@@ -18485,8 +19752,8 @@
         </w:pict>
       </w:r>
     </w:p>
-    <w:bookmarkEnd w:id="113"/>
-    <w:bookmarkStart w:id="116" w:name="chapter-30-the-frequency-war"/>
+    <w:bookmarkEnd w:id="117"/>
+    <w:bookmarkStart w:id="120" w:name="chapter-30-the-frequency-war"/>
     <w:p>
       <w:pPr>
         <w:pStyle w:val="Heading1"/>
@@ -18627,7 +19894,7 @@
         <w:t xml:space="preserve">Interference. Static. Noise on the line. A jammed receiver.</w:t>
       </w:r>
     </w:p>
-    <w:bookmarkStart w:id="114" w:name="the-black-mirror"/>
+    <w:bookmarkStart w:id="118" w:name="the-black-mirror"/>
     <w:p>
       <w:pPr>
         <w:pStyle w:val="Heading2"/>
@@ -18772,8 +20039,8 @@
         <w:t xml:space="preserve">The black mirror is the most sophisticated scrying device ever created. And almost everyone carries one willingly, gazes into it constantly, and receives its visions without question.</w:t>
       </w:r>
     </w:p>
-    <w:bookmarkEnd w:id="114"/>
-    <w:bookmarkStart w:id="115" w:name="the-ai-timeline-61-years-in-the-shadows"/>
+    <w:bookmarkEnd w:id="118"/>
+    <w:bookmarkStart w:id="119" w:name="the-ai-timeline-61-years-in-the-shadows"/>
     <w:p>
       <w:pPr>
         <w:pStyle w:val="Heading2"/>
@@ -19032,9 +20299,9 @@
         </w:pict>
       </w:r>
     </w:p>
-    <w:bookmarkEnd w:id="115"/>
-    <w:bookmarkEnd w:id="116"/>
-    <w:bookmarkStart w:id="117" w:name="chapter-31-the-hidden-cosmology"/>
+    <w:bookmarkEnd w:id="119"/>
+    <w:bookmarkEnd w:id="120"/>
+    <w:bookmarkStart w:id="121" w:name="chapter-31-the-hidden-cosmology"/>
     <w:p>
       <w:pPr>
         <w:pStyle w:val="Heading1"/>
@@ -19516,8 +20783,8 @@
         </w:pict>
       </w:r>
     </w:p>
-    <w:bookmarkEnd w:id="117"/>
-    <w:bookmarkStart w:id="118" w:name="part-nine-the-hollow-world"/>
+    <w:bookmarkEnd w:id="121"/>
+    <w:bookmarkStart w:id="122" w:name="part-nine-the-hollow-world"/>
     <w:p>
       <w:pPr>
         <w:pStyle w:val="Heading1"/>
@@ -19533,8 +20800,8 @@
         </w:pict>
       </w:r>
     </w:p>
-    <w:bookmarkEnd w:id="118"/>
-    <w:bookmarkStart w:id="119" w:name="chapter-32-the-hollow-souls"/>
+    <w:bookmarkEnd w:id="122"/>
+    <w:bookmarkStart w:id="123" w:name="chapter-32-the-hollow-souls"/>
     <w:p>
       <w:pPr>
         <w:pStyle w:val="Heading1"/>
@@ -19632,8 +20899,8 @@
         </w:pict>
       </w:r>
     </w:p>
-    <w:bookmarkEnd w:id="119"/>
-    <w:bookmarkStart w:id="120" w:name="chapter-33-ufos-and-the-alien-deception"/>
+    <w:bookmarkEnd w:id="123"/>
+    <w:bookmarkStart w:id="124" w:name="chapter-33-ufos-and-the-alien-deception"/>
     <w:p>
       <w:pPr>
         <w:pStyle w:val="Heading1"/>
@@ -19723,8 +20990,8 @@
         </w:pict>
       </w:r>
     </w:p>
-    <w:bookmarkEnd w:id="120"/>
-    <w:bookmarkStart w:id="121" w:name="part-ten-the-hidden-timeline"/>
+    <w:bookmarkEnd w:id="124"/>
+    <w:bookmarkStart w:id="125" w:name="part-ten-the-hidden-timeline"/>
     <w:p>
       <w:pPr>
         <w:pStyle w:val="Heading1"/>
@@ -19740,8 +21007,8 @@
         </w:pict>
       </w:r>
     </w:p>
-    <w:bookmarkEnd w:id="121"/>
-    <w:bookmarkStart w:id="122" w:name="chapter-34-the-missing-millennium"/>
+    <w:bookmarkEnd w:id="125"/>
+    <w:bookmarkStart w:id="127" w:name="chapter-34-the-missing-millennium"/>
     <w:p>
       <w:pPr>
         <w:pStyle w:val="Heading1"/>
@@ -19864,6 +21131,97 @@
       </w:pPr>
       <w:r>
         <w:t xml:space="preserve">The timeline matters because it changes expectations. If the millennium is future, we wait for rescue. If the millennium is past, we’re in the final battle.</w:t>
+      </w:r>
+    </w:p>
+    <w:bookmarkStart w:id="126" w:name="authors-thoughts-4"/>
+    <w:p>
+      <w:pPr>
+        <w:pStyle w:val="Heading3"/>
+      </w:pPr>
+      <w:r>
+        <w:t xml:space="preserve">✦ AUTHOR’S THOUGHTS ✦</w:t>
+      </w:r>
+    </w:p>
+    <w:p>
+      <w:pPr>
+        <w:pStyle w:val="FirstParagraph"/>
+      </w:pPr>
+      <w:r>
+        <w:rPr>
+          <w:b/>
+          <w:bCs/>
+        </w:rPr>
+        <w:t xml:space="preserve">The Reordered Timeline</w:t>
+      </w:r>
+    </w:p>
+    <w:p>
+      <w:pPr>
+        <w:pStyle w:val="BodyText"/>
+      </w:pPr>
+      <w:r>
+        <w:t xml:space="preserve">What if we’ve been taught the prophetic timeline in the wrong order? Traditional teaching says: Rapture → Tribulation → Second Coming → 1000 Year Reign → Satan Released → Armageddon → Final Judgment.</w:t>
+      </w:r>
+    </w:p>
+    <w:p>
+      <w:pPr>
+        <w:pStyle w:val="BodyText"/>
+      </w:pPr>
+      <w:r>
+        <w:t xml:space="preserve">But consider the alternative: What if the true Messiah has already returned? What if the millennial reign has already happened - during what we call the medieval period, when faith spread across the known world and cathedrals rose to heaven? What if history was then erased, reset, and we now find ourselves in Satan’s</w:t>
+      </w:r>
+      <w:r>
+        <w:t xml:space="preserve"> </w:t>
+      </w:r>
+      <w:r>
+        <w:t xml:space="preserve">“</w:t>
+      </w:r>
+      <w:r>
+        <w:t xml:space="preserve">little season</w:t>
+      </w:r>
+      <w:r>
+        <w:t xml:space="preserve">”</w:t>
+      </w:r>
+      <w:r>
+        <w:t xml:space="preserve"> </w:t>
+      </w:r>
+      <w:r>
+        <w:t xml:space="preserve">described in Revelation 20?</w:t>
+      </w:r>
+    </w:p>
+    <w:p>
+      <w:pPr>
+        <w:pStyle w:val="BodyText"/>
+      </w:pPr>
+      <w:r>
+        <w:t xml:space="preserve">This would mean the timeline is: True Messiah returned → 1000 Year Reign occurred → Reset/Erasure →</w:t>
+      </w:r>
+      <w:r>
+        <w:t xml:space="preserve"> </w:t>
+      </w:r>
+      <w:r>
+        <w:rPr>
+          <w:i/>
+          <w:iCs/>
+        </w:rPr>
+        <w:t xml:space="preserve">We are NOW in Satan’s little season</w:t>
+      </w:r>
+      <w:r>
+        <w:t xml:space="preserve"> </w:t>
+      </w:r>
+      <w:r>
+        <w:t xml:space="preserve">→ False messiah appears → Mark willingly accepted → Script flips → Tribulation → Final Judgment.</w:t>
+      </w:r>
+    </w:p>
+    <w:p>
+      <w:pPr>
+        <w:pStyle w:val="BodyText"/>
+      </w:pPr>
+      <w:r>
+        <w:rPr>
+          <w:i/>
+          <w:iCs/>
+        </w:rPr>
+        <w:t xml:space="preserve">Everyone is looking for something that may have already happened. And the very fact that no one considers this possibility? That everyone dismisses it without examination? That is itself evidence of the deception working exactly as designed.</w:t>
       </w:r>
     </w:p>
     <w:p>
@@ -19873,8 +21231,9 @@
         </w:pict>
       </w:r>
     </w:p>
-    <w:bookmarkEnd w:id="122"/>
-    <w:bookmarkStart w:id="126" w:name="chapter-35-the-short-season"/>
+    <w:bookmarkEnd w:id="126"/>
+    <w:bookmarkEnd w:id="127"/>
+    <w:bookmarkStart w:id="132" w:name="chapter-35-the-short-season"/>
     <w:p>
       <w:pPr>
         <w:pStyle w:val="Heading1"/>
@@ -19917,7 +21276,7 @@
         <w:t xml:space="preserve">The theory suggests: the thousand-year reign of the Messiah occurred during what we call the medieval period. This was the age of cathedral building, of widespread faith, of Christianity spreading across the known world.</w:t>
       </w:r>
     </w:p>
-    <w:bookmarkStart w:id="123" w:name="the-mortal-head-wound"/>
+    <w:bookmarkStart w:id="128" w:name="the-mortal-head-wound"/>
     <w:p>
       <w:pPr>
         <w:pStyle w:val="Heading2"/>
@@ -19980,8 +21339,181 @@
         <w:t xml:space="preserve">- was actually an age of faith. Cathedrals rose across Europe. Monasteries preserved knowledge. The church, for all its flaws, kept the memory of the Messiah alive. The beast lay wounded.</w:t>
       </w:r>
     </w:p>
-    <w:bookmarkEnd w:id="123"/>
-    <w:bookmarkStart w:id="124" w:name="the-renaissance-the-wound-heals"/>
+    <w:p>
+      <w:pPr>
+        <w:pStyle w:val="BodyText"/>
+      </w:pPr>
+      <w:r>
+        <w:t xml:space="preserve">Consider the inversion: they called it the</w:t>
+      </w:r>
+      <w:r>
+        <w:t xml:space="preserve"> </w:t>
+      </w:r>
+      <w:r>
+        <w:rPr>
+          <w:b/>
+          <w:bCs/>
+        </w:rPr>
+        <w:t xml:space="preserve">“</w:t>
+      </w:r>
+      <w:r>
+        <w:rPr>
+          <w:b/>
+          <w:bCs/>
+        </w:rPr>
+        <w:t xml:space="preserve">Dark Ages.</w:t>
+      </w:r>
+      <w:r>
+        <w:rPr>
+          <w:b/>
+          <w:bCs/>
+        </w:rPr>
+        <w:t xml:space="preserve">”</w:t>
+      </w:r>
+      <w:r>
+        <w:t xml:space="preserve"> </w:t>
+      </w:r>
+      <w:r>
+        <w:t xml:space="preserve">The angel of light, the deceiver, labeled the millennial reign - the age of faith, of cathedrals reaching toward heaven, of the beast lying wounded - as</w:t>
+      </w:r>
+      <w:r>
+        <w:t xml:space="preserve"> </w:t>
+      </w:r>
+      <w:r>
+        <w:t xml:space="preserve">“</w:t>
+      </w:r>
+      <w:r>
+        <w:t xml:space="preserve">dark.</w:t>
+      </w:r>
+      <w:r>
+        <w:t xml:space="preserve">”</w:t>
+      </w:r>
+      <w:r>
+        <w:t xml:space="preserve"> </w:t>
+      </w:r>
+      <w:r>
+        <w:t xml:space="preserve">Meanwhile, the</w:t>
+      </w:r>
+      <w:r>
+        <w:t xml:space="preserve"> </w:t>
+      </w:r>
+      <w:r>
+        <w:t xml:space="preserve">“</w:t>
+      </w:r>
+      <w:r>
+        <w:t xml:space="preserve">Enlightenment</w:t>
+      </w:r>
+      <w:r>
+        <w:t xml:space="preserve">”</w:t>
+      </w:r>
+      <w:r>
+        <w:t xml:space="preserve"> </w:t>
+      </w:r>
+      <w:r>
+        <w:t xml:space="preserve">that followed - which brought humanism, reason over revelation, the marginalization of the Creator - that was called</w:t>
+      </w:r>
+      <w:r>
+        <w:t xml:space="preserve"> </w:t>
+      </w:r>
+      <w:r>
+        <w:t xml:space="preserve">“</w:t>
+      </w:r>
+      <w:r>
+        <w:t xml:space="preserve">light.</w:t>
+      </w:r>
+      <w:r>
+        <w:t xml:space="preserve">”</w:t>
+      </w:r>
+    </w:p>
+    <w:p>
+      <w:pPr>
+        <w:pStyle w:val="BodyText"/>
+      </w:pPr>
+      <w:r>
+        <w:t xml:space="preserve">Complete inversion. Call the light dark. Call the dark light. Yesha’yahu (Isaiah) 5:20:</w:t>
+      </w:r>
+      <w:r>
+        <w:t xml:space="preserve"> </w:t>
+      </w:r>
+      <w:r>
+        <w:t xml:space="preserve">“</w:t>
+      </w:r>
+      <w:r>
+        <w:t xml:space="preserve">Woe unto them that call evil good, and good evil; that put darkness for light, and light for darkness.</w:t>
+      </w:r>
+      <w:r>
+        <w:t xml:space="preserve">”</w:t>
+      </w:r>
+    </w:p>
+    <w:p>
+      <w:pPr>
+        <w:pStyle w:val="BodyText"/>
+      </w:pPr>
+      <w:r>
+        <w:t xml:space="preserve">If the adversary wanted to ensure no one ever looked at the medieval period as the millennial reign, what better strategy than to label it</w:t>
+      </w:r>
+      <w:r>
+        <w:t xml:space="preserve"> </w:t>
+      </w:r>
+      <w:r>
+        <w:t xml:space="preserve">“</w:t>
+      </w:r>
+      <w:r>
+        <w:t xml:space="preserve">dark</w:t>
+      </w:r>
+      <w:r>
+        <w:t xml:space="preserve">”</w:t>
+      </w:r>
+      <w:r>
+        <w:t xml:space="preserve">? To make historians dismiss it as a primitive time of ignorance? To make modern people feel superior to those</w:t>
+      </w:r>
+      <w:r>
+        <w:t xml:space="preserve"> </w:t>
+      </w:r>
+      <w:r>
+        <w:t xml:space="preserve">“</w:t>
+      </w:r>
+      <w:r>
+        <w:t xml:space="preserve">backward</w:t>
+      </w:r>
+      <w:r>
+        <w:t xml:space="preserve">”</w:t>
+      </w:r>
+      <w:r>
+        <w:t xml:space="preserve"> </w:t>
+      </w:r>
+      <w:r>
+        <w:t xml:space="preserve">centuries of faith?</w:t>
+      </w:r>
+    </w:p>
+    <w:p>
+      <w:pPr>
+        <w:pStyle w:val="BodyText"/>
+      </w:pPr>
+      <w:r>
+        <w:t xml:space="preserve">The very name</w:t>
+      </w:r>
+      <w:r>
+        <w:t xml:space="preserve"> </w:t>
+      </w:r>
+      <w:r>
+        <w:t xml:space="preserve">“</w:t>
+      </w:r>
+      <w:r>
+        <w:t xml:space="preserve">Dark Ages</w:t>
+      </w:r>
+      <w:r>
+        <w:t xml:space="preserve">”</w:t>
+      </w:r>
+      <w:r>
+        <w:t xml:space="preserve"> </w:t>
+      </w:r>
+      <w:r>
+        <w:t xml:space="preserve">may be the signature of the deception - the adversary’s mockery hidden in plain sight.</w:t>
+      </w:r>
+    </w:p>
+    <w:bookmarkEnd w:id="128"/>
+    <w:bookmarkStart w:id="129" w:name="the-renaissance-the-wound-heals"/>
     <w:p>
       <w:pPr>
         <w:pStyle w:val="Heading2"/>
@@ -20169,8 +21701,8 @@
         <w:t xml:space="preserve">”</w:t>
       </w:r>
     </w:p>
-    <w:bookmarkEnd w:id="124"/>
-    <w:bookmarkStart w:id="125" w:name="the-acceleration"/>
+    <w:bookmarkEnd w:id="129"/>
+    <w:bookmarkStart w:id="131" w:name="the-acceleration"/>
     <w:p>
       <w:pPr>
         <w:pStyle w:val="Heading2"/>
@@ -20612,6 +22144,105 @@
         <w:t xml:space="preserve">The deception is at its peak. The technology of control is fully deployed. The inversion of everything true is nearly complete. And the final confrontation is approaching.</w:t>
       </w:r>
     </w:p>
+    <w:bookmarkStart w:id="130" w:name="authors-thoughts-5"/>
+    <w:p>
+      <w:pPr>
+        <w:pStyle w:val="Heading3"/>
+      </w:pPr>
+      <w:r>
+        <w:t xml:space="preserve">✦ AUTHOR’S THOUGHTS ✦</w:t>
+      </w:r>
+    </w:p>
+    <w:p>
+      <w:pPr>
+        <w:pStyle w:val="FirstParagraph"/>
+      </w:pPr>
+      <w:r>
+        <w:rPr>
+          <w:b/>
+          <w:bCs/>
+        </w:rPr>
+        <w:t xml:space="preserve">The Hydra</w:t>
+      </w:r>
+    </w:p>
+    <w:p>
+      <w:pPr>
+        <w:pStyle w:val="BodyText"/>
+      </w:pPr>
+      <w:r>
+        <w:t xml:space="preserve">The beast with seven heads. Cut one off and another appears. Every layer of deception revealed just uncovers another. You think you finally understand, and five more layers emerge. The system is so entrenched, so multi-dimensional, so thoroughly woven into every aspect of life that you’d have to look in five hundred directions simultaneously to keep up.</w:t>
+      </w:r>
+    </w:p>
+    <w:p>
+      <w:pPr>
+        <w:pStyle w:val="BodyText"/>
+      </w:pPr>
+      <w:r>
+        <w:t xml:space="preserve">That’s why this understanding is terrifying. It’s not one thing to fix. It’s not one lie to expose. It’s everything. The names. The calendar. The holidays. The institutions. The entertainment. The news. The education. The religion. All of it working together, each piece reinforcing the others, each layer hiding the next.</w:t>
+      </w:r>
+    </w:p>
+    <w:p>
+      <w:pPr>
+        <w:pStyle w:val="BodyText"/>
+      </w:pPr>
+      <w:r>
+        <w:t xml:space="preserve">Maybe that’s why this understanding is emerging now - not because it wasn’t there before, but because the time is approaching when it needs to be known. Maybe it signifies the actual time we are in. The veil lifting for those with eyes to see, even as the deception intensifies for those without.</w:t>
+      </w:r>
+    </w:p>
+    <w:p>
+      <w:pPr>
+        <w:pStyle w:val="BodyText"/>
+      </w:pPr>
+      <w:r>
+        <w:rPr>
+          <w:i/>
+          <w:iCs/>
+        </w:rPr>
+        <w:t xml:space="preserve">Once you know, you can’t unknow. It doesn’t change the facts - it changes you. You’re no longer oblivious. You’re no longer ignorant. And that clarity, as terrifying as it may be, is exactly what faith is for. Not believing in something you can’t see - but</w:t>
+      </w:r>
+      <w:r>
+        <w:rPr>
+          <w:i/>
+          <w:iCs/>
+        </w:rPr>
+        <w:t xml:space="preserve"> </w:t>
+      </w:r>
+      <w:r>
+        <w:rPr>
+          <w:b/>
+          <w:bCs/>
+          <w:i/>
+          <w:iCs/>
+        </w:rPr>
+        <w:t xml:space="preserve">knowing</w:t>
+      </w:r>
+      <w:r>
+        <w:rPr>
+          <w:i/>
+          <w:iCs/>
+        </w:rPr>
+        <w:t xml:space="preserve"> </w:t>
+      </w:r>
+      <w:r>
+        <w:rPr>
+          <w:i/>
+          <w:iCs/>
+        </w:rPr>
+        <w:t xml:space="preserve">that the promise made will be kept. Knowing that what has been revealed was revealed for a reason. Knowing that you were meant to see this, now, in this time.</w:t>
+      </w:r>
+    </w:p>
+    <w:p>
+      <w:pPr>
+        <w:pStyle w:val="BodyText"/>
+      </w:pPr>
+      <w:r>
+        <w:rPr>
+          <w:i/>
+          <w:iCs/>
+        </w:rPr>
+        <w:t xml:space="preserve">The fear is real. I felt it writing these words. But the promise is also real. And the One who made it does not lie.</w:t>
+      </w:r>
+    </w:p>
     <w:p>
       <w:pPr>
         <w:pStyle w:val="BodyText"/>
@@ -20627,9 +22258,10 @@
         </w:pict>
       </w:r>
     </w:p>
-    <w:bookmarkEnd w:id="125"/>
-    <w:bookmarkEnd w:id="126"/>
-    <w:bookmarkStart w:id="135" w:name="Xc8a35c5b2ad61239328d04e6bad52da1a09b367"/>
+    <w:bookmarkEnd w:id="130"/>
+    <w:bookmarkEnd w:id="131"/>
+    <w:bookmarkEnd w:id="132"/>
+    <w:bookmarkStart w:id="141" w:name="Xc8a35c5b2ad61239328d04e6bad52da1a09b367"/>
     <w:p>
       <w:pPr>
         <w:pStyle w:val="Heading1"/>
@@ -20654,7 +22286,7 @@
         <w:t xml:space="preserve">Understanding this architecture of deception is essential for navigating it.</w:t>
       </w:r>
     </w:p>
-    <w:bookmarkStart w:id="127" w:name="layer-one-the-surface-narrative"/>
+    <w:bookmarkStart w:id="133" w:name="layer-one-the-surface-narrative"/>
     <w:p>
       <w:pPr>
         <w:pStyle w:val="Heading2"/>
@@ -20679,8 +22311,8 @@
         <w:t xml:space="preserve">Most people live here. They don’t question because they don’t know there’s anything to question. The programming is so complete that the thought of alternatives never arises.</w:t>
       </w:r>
     </w:p>
-    <w:bookmarkEnd w:id="127"/>
-    <w:bookmarkStart w:id="128" w:name="layer-two-the-conspiracy-theory-layer"/>
+    <w:bookmarkEnd w:id="133"/>
+    <w:bookmarkStart w:id="134" w:name="layer-two-the-conspiracy-theory-layer"/>
     <w:p>
       <w:pPr>
         <w:pStyle w:val="Heading2"/>
@@ -20779,8 +22411,8 @@
         <w:t xml:space="preserve">was created at this layer - CIA Dispatch 1035-960, designed to shut down questions about real operations.</w:t>
       </w:r>
     </w:p>
-    <w:bookmarkEnd w:id="128"/>
-    <w:bookmarkStart w:id="129" w:name="layer-three-the-controlled-opposition"/>
+    <w:bookmarkEnd w:id="134"/>
+    <w:bookmarkStart w:id="135" w:name="layer-three-the-controlled-opposition"/>
     <w:p>
       <w:pPr>
         <w:pStyle w:val="Heading2"/>
@@ -20846,8 +22478,8 @@
         <w:t xml:space="preserve">? Who has platforms while others are completely silenced? Who always stops short of certain topics?</w:t>
       </w:r>
     </w:p>
-    <w:bookmarkEnd w:id="129"/>
-    <w:bookmarkStart w:id="130" w:name="Xf74bf1363a38f39d87a2fa167816a189e3b6e6e"/>
+    <w:bookmarkEnd w:id="135"/>
+    <w:bookmarkStart w:id="136" w:name="Xf74bf1363a38f39d87a2fa167816a189e3b6e6e"/>
     <w:p>
       <w:pPr>
         <w:pStyle w:val="Heading2"/>
@@ -20956,8 +22588,8 @@
         <w:t xml:space="preserve">Someone can spend their entire life in sincere devotion within this layer and never reach the actual signal. They’re praying to a substituted name, worshiping on a substituted day, following a substituted calendar - and feeling spiritual while doing it.</w:t>
       </w:r>
     </w:p>
-    <w:bookmarkEnd w:id="130"/>
-    <w:bookmarkStart w:id="131" w:name="layer-five-the-1948-deception"/>
+    <w:bookmarkEnd w:id="136"/>
+    <w:bookmarkStart w:id="137" w:name="layer-five-the-1948-deception"/>
     <w:p>
       <w:pPr>
         <w:pStyle w:val="Heading2"/>
@@ -21181,8 +22813,8 @@
         <w:t xml:space="preserve">and we’re in the little season now, then 1948 wasn’t the prophetic fulfillment everyone assumes. It was another layer of the deception - designed to keep people waiting for something that already occurred.</w:t>
       </w:r>
     </w:p>
-    <w:bookmarkEnd w:id="131"/>
-    <w:bookmarkStart w:id="132" w:name="layer-six-the-antichrist-redirect"/>
+    <w:bookmarkEnd w:id="137"/>
+    <w:bookmarkStart w:id="138" w:name="layer-six-the-antichrist-redirect"/>
     <w:p>
       <w:pPr>
         <w:pStyle w:val="Heading2"/>
@@ -21445,8 +23077,8 @@
         <w:t xml:space="preserve">This is why the name matters. Not legalism. Not religious hair-splitting. Frequency. The name Yahusha contains the name of the Father (Yah). The name Jesus contains nothing. Different names, different frequencies, different connections.</w:t>
       </w:r>
     </w:p>
-    <w:bookmarkEnd w:id="132"/>
-    <w:bookmarkStart w:id="133" w:name="X0510c2b265b7d7c04df9e455c92ee96273d3b25"/>
+    <w:bookmarkEnd w:id="138"/>
+    <w:bookmarkStart w:id="139" w:name="X0510c2b265b7d7c04df9e455c92ee96273d3b25"/>
     <w:p>
       <w:pPr>
         <w:pStyle w:val="Heading2"/>
@@ -21527,8 +23159,8 @@
         <w:t xml:space="preserve">The truth is told as fiction so that when it manifests as fact, the mind has already categorized it as fantasy.</w:t>
       </w:r>
     </w:p>
-    <w:bookmarkEnd w:id="133"/>
-    <w:bookmarkStart w:id="134" w:name="navigating-the-layers"/>
+    <w:bookmarkEnd w:id="139"/>
+    <w:bookmarkStart w:id="140" w:name="navigating-the-layers"/>
     <w:p>
       <w:pPr>
         <w:pStyle w:val="Heading2"/>
@@ -21592,9 +23224,9 @@
         </w:pict>
       </w:r>
     </w:p>
-    <w:bookmarkEnd w:id="134"/>
-    <w:bookmarkEnd w:id="135"/>
-    <w:bookmarkStart w:id="136" w:name="chapter-37-the-coming-deception"/>
+    <w:bookmarkEnd w:id="140"/>
+    <w:bookmarkEnd w:id="141"/>
+    <w:bookmarkStart w:id="142" w:name="chapter-37-the-coming-deception"/>
     <w:p>
       <w:pPr>
         <w:pStyle w:val="Heading1"/>
@@ -21688,8 +23320,8 @@
         </w:pict>
       </w:r>
     </w:p>
-    <w:bookmarkEnd w:id="136"/>
-    <w:bookmarkStart w:id="137" w:name="part-eleven-the-awakening"/>
+    <w:bookmarkEnd w:id="142"/>
+    <w:bookmarkStart w:id="143" w:name="part-eleven-the-awakening"/>
     <w:p>
       <w:pPr>
         <w:pStyle w:val="Heading1"/>
@@ -21705,8 +23337,8 @@
         </w:pict>
       </w:r>
     </w:p>
-    <w:bookmarkEnd w:id="137"/>
-    <w:bookmarkStart w:id="138" w:name="X317d4705101176a747e42f6414b050e1f47c678"/>
+    <w:bookmarkEnd w:id="143"/>
+    <w:bookmarkStart w:id="144" w:name="X317d4705101176a747e42f6414b050e1f47c678"/>
     <w:p>
       <w:pPr>
         <w:pStyle w:val="Heading1"/>
@@ -21912,8 +23544,8 @@
         </w:pict>
       </w:r>
     </w:p>
-    <w:bookmarkEnd w:id="138"/>
-    <w:bookmarkStart w:id="139" w:name="chapter-38-the-stages-of-awakening"/>
+    <w:bookmarkEnd w:id="144"/>
+    <w:bookmarkStart w:id="145" w:name="chapter-38-the-stages-of-awakening"/>
     <w:p>
       <w:pPr>
         <w:pStyle w:val="Heading1"/>
@@ -22167,8 +23799,8 @@
         </w:pict>
       </w:r>
     </w:p>
-    <w:bookmarkEnd w:id="139"/>
-    <w:bookmarkStart w:id="140" w:name="chapter-39-the-collective-awakening"/>
+    <w:bookmarkEnd w:id="145"/>
+    <w:bookmarkStart w:id="146" w:name="chapter-39-the-collective-awakening"/>
     <w:p>
       <w:pPr>
         <w:pStyle w:val="Heading1"/>
@@ -22240,8 +23872,8 @@
         </w:pict>
       </w:r>
     </w:p>
-    <w:bookmarkEnd w:id="140"/>
-    <w:bookmarkStart w:id="141" w:name="part-twelve-the-restoration"/>
+    <w:bookmarkEnd w:id="146"/>
+    <w:bookmarkStart w:id="147" w:name="part-twelve-the-restoration"/>
     <w:p>
       <w:pPr>
         <w:pStyle w:val="Heading1"/>
@@ -22257,8 +23889,8 @@
         </w:pict>
       </w:r>
     </w:p>
-    <w:bookmarkEnd w:id="141"/>
-    <w:bookmarkStart w:id="144" w:name="chapter-40-the-path-forward"/>
+    <w:bookmarkEnd w:id="147"/>
+    <w:bookmarkStart w:id="150" w:name="chapter-40-the-path-forward"/>
     <w:p>
       <w:pPr>
         <w:pStyle w:val="Heading1"/>
@@ -22275,7 +23907,7 @@
         <w:t xml:space="preserve">Information without application is entertainment. The point isn’t to accumulate knowledge. It’s to live differently.</w:t>
       </w:r>
     </w:p>
-    <w:bookmarkStart w:id="142" w:name="the-two-things-that-matter"/>
+    <w:bookmarkStart w:id="148" w:name="the-two-things-that-matter"/>
     <w:p>
       <w:pPr>
         <w:pStyle w:val="Heading2"/>
@@ -22554,8 +24186,8 @@
         <w:t xml:space="preserve">Everything else is commentary.</w:t>
       </w:r>
     </w:p>
-    <w:bookmarkEnd w:id="142"/>
-    <w:bookmarkStart w:id="143" w:name="practical-steps"/>
+    <w:bookmarkEnd w:id="148"/>
+    <w:bookmarkStart w:id="149" w:name="practical-steps"/>
     <w:p>
       <w:pPr>
         <w:pStyle w:val="Heading2"/>
@@ -22747,9 +24379,9 @@
         </w:pict>
       </w:r>
     </w:p>
-    <w:bookmarkEnd w:id="143"/>
-    <w:bookmarkEnd w:id="144"/>
-    <w:bookmarkStart w:id="145" w:name="X93c0d4badd32a658709da8714d741082d956076"/>
+    <w:bookmarkEnd w:id="149"/>
+    <w:bookmarkEnd w:id="150"/>
+    <w:bookmarkStart w:id="151" w:name="X93c0d4badd32a658709da8714d741082d956076"/>
     <w:p>
       <w:pPr>
         <w:pStyle w:val="Heading1"/>
@@ -22905,8 +24537,8 @@
         </w:pict>
       </w:r>
     </w:p>
-    <w:bookmarkEnd w:id="145"/>
-    <w:bookmarkStart w:id="150" w:name="chapter-42-final-reflections"/>
+    <w:bookmarkEnd w:id="151"/>
+    <w:bookmarkStart w:id="156" w:name="chapter-42-final-reflections"/>
     <w:p>
       <w:pPr>
         <w:pStyle w:val="Heading1"/>
@@ -22978,7 +24610,7 @@
         </w:pict>
       </w:r>
     </w:p>
-    <w:bookmarkStart w:id="146" w:name="a-word-to-the-skeptic"/>
+    <w:bookmarkStart w:id="152" w:name="a-word-to-the-skeptic"/>
     <w:p>
       <w:pPr>
         <w:pStyle w:val="Heading2"/>
@@ -23026,8 +24658,8 @@
         </w:pict>
       </w:r>
     </w:p>
-    <w:bookmarkEnd w:id="146"/>
-    <w:bookmarkStart w:id="147" w:name="a-word-to-the-believer"/>
+    <w:bookmarkEnd w:id="152"/>
+    <w:bookmarkStart w:id="153" w:name="a-word-to-the-believer"/>
     <w:p>
       <w:pPr>
         <w:pStyle w:val="Heading2"/>
@@ -23067,8 +24699,8 @@
         </w:pict>
       </w:r>
     </w:p>
-    <w:bookmarkEnd w:id="147"/>
-    <w:bookmarkStart w:id="148" w:name="a-word-to-the-seeker"/>
+    <w:bookmarkEnd w:id="153"/>
+    <w:bookmarkStart w:id="154" w:name="a-word-to-the-seeker"/>
     <w:p>
       <w:pPr>
         <w:pStyle w:val="Heading2"/>
@@ -23116,8 +24748,8 @@
         </w:pict>
       </w:r>
     </w:p>
-    <w:bookmarkEnd w:id="148"/>
-    <w:bookmarkStart w:id="149" w:name="the-prayer-of-the-awakening"/>
+    <w:bookmarkEnd w:id="154"/>
+    <w:bookmarkStart w:id="155" w:name="the-prayer-of-the-awakening"/>
     <w:p>
       <w:pPr>
         <w:pStyle w:val="Heading2"/>
@@ -23261,9 +24893,9 @@
         </w:pict>
       </w:r>
     </w:p>
-    <w:bookmarkEnd w:id="149"/>
-    <w:bookmarkEnd w:id="150"/>
-    <w:bookmarkStart w:id="168" w:name="appendix-reference-materials"/>
+    <w:bookmarkEnd w:id="155"/>
+    <w:bookmarkEnd w:id="156"/>
+    <w:bookmarkStart w:id="174" w:name="appendix-reference-materials"/>
     <w:p>
       <w:pPr>
         <w:pStyle w:val="Heading1"/>
@@ -23279,7 +24911,7 @@
         </w:pict>
       </w:r>
     </w:p>
-    <w:bookmarkStart w:id="153" w:name="comprehensive-concordance"/>
+    <w:bookmarkStart w:id="159" w:name="comprehensive-concordance"/>
     <w:p>
       <w:pPr>
         <w:pStyle w:val="Heading2"/>
@@ -23288,7 +24920,7 @@
         <w:t xml:space="preserve">COMPREHENSIVE CONCORDANCE</w:t>
       </w:r>
     </w:p>
-    <w:bookmarkStart w:id="151" w:name="divine-names-and-titles"/>
+    <w:bookmarkStart w:id="157" w:name="divine-names-and-titles"/>
     <w:p>
       <w:pPr>
         <w:pStyle w:val="Heading3"/>
@@ -23835,8 +25467,8 @@
         </w:pict>
       </w:r>
     </w:p>
-    <w:bookmarkEnd w:id="151"/>
-    <w:bookmarkStart w:id="152" w:name="key-concepts-and-terms"/>
+    <w:bookmarkEnd w:id="157"/>
+    <w:bookmarkStart w:id="158" w:name="key-concepts-and-terms"/>
     <w:p>
       <w:pPr>
         <w:pStyle w:val="Heading3"/>
@@ -25912,9 +27544,9 @@
         </w:pict>
       </w:r>
     </w:p>
-    <w:bookmarkEnd w:id="152"/>
-    <w:bookmarkEnd w:id="153"/>
-    <w:bookmarkStart w:id="154" w:name="language-inversions-summary"/>
+    <w:bookmarkEnd w:id="158"/>
+    <w:bookmarkEnd w:id="159"/>
+    <w:bookmarkStart w:id="160" w:name="language-inversions-summary"/>
     <w:p>
       <w:pPr>
         <w:pStyle w:val="Heading2"/>
@@ -26165,8 +27797,8 @@
         <w:t xml:space="preserve">→ Possibly invoking Amun, Egyptian sun god</w:t>
       </w:r>
     </w:p>
-    <w:bookmarkEnd w:id="154"/>
-    <w:bookmarkStart w:id="155" w:name="calendar-inversions-summary"/>
+    <w:bookmarkEnd w:id="160"/>
+    <w:bookmarkStart w:id="161" w:name="calendar-inversions-summary"/>
     <w:p>
       <w:pPr>
         <w:pStyle w:val="Heading2"/>
@@ -26285,8 +27917,8 @@
         <w:t xml:space="preserve">→ Lupercalia, Roman fertility festival, rebranded</w:t>
       </w:r>
     </w:p>
-    <w:bookmarkEnd w:id="155"/>
-    <w:bookmarkStart w:id="156" w:name="historical-inversions-summary"/>
+    <w:bookmarkEnd w:id="161"/>
+    <w:bookmarkStart w:id="162" w:name="historical-inversions-summary"/>
     <w:p>
       <w:pPr>
         <w:pStyle w:val="Heading2"/>
@@ -26427,8 +28059,8 @@
         <w:t xml:space="preserve">→ Dragons rebranded</w:t>
       </w:r>
     </w:p>
-    <w:bookmarkEnd w:id="156"/>
-    <w:bookmarkStart w:id="157" w:name="cosmological-inversions-summary"/>
+    <w:bookmarkEnd w:id="162"/>
+    <w:bookmarkStart w:id="163" w:name="cosmological-inversions-summary"/>
     <w:p>
       <w:pPr>
         <w:pStyle w:val="Heading2"/>
@@ -26554,8 +28186,8 @@
         </w:pict>
       </w:r>
     </w:p>
-    <w:bookmarkEnd w:id="157"/>
-    <w:bookmarkStart w:id="158" w:name="timeline-of-deception"/>
+    <w:bookmarkEnd w:id="163"/>
+    <w:bookmarkStart w:id="164" w:name="timeline-of-deception"/>
     <w:p>
       <w:pPr>
         <w:pStyle w:val="Heading2"/>
@@ -26877,8 +28509,8 @@
         </w:pict>
       </w:r>
     </w:p>
-    <w:bookmarkEnd w:id="158"/>
-    <w:bookmarkStart w:id="159" w:name="cross-reference-of-key-scriptures"/>
+    <w:bookmarkEnd w:id="164"/>
+    <w:bookmarkStart w:id="165" w:name="cross-reference-of-key-scriptures"/>
     <w:p>
       <w:pPr>
         <w:pStyle w:val="Heading2"/>
@@ -27872,8 +29504,8 @@
         </w:pict>
       </w:r>
     </w:p>
-    <w:bookmarkEnd w:id="159"/>
-    <w:bookmarkStart w:id="160" w:name="research-directions"/>
+    <w:bookmarkEnd w:id="165"/>
+    <w:bookmarkStart w:id="166" w:name="research-directions"/>
     <w:p>
       <w:pPr>
         <w:pStyle w:val="Heading2"/>
@@ -28041,8 +29673,8 @@
         </w:pict>
       </w:r>
     </w:p>
-    <w:bookmarkEnd w:id="160"/>
-    <w:bookmarkStart w:id="161" w:name="Xa0971b78a8a348664b4c69706cae37fc055ba55"/>
+    <w:bookmarkEnd w:id="166"/>
+    <w:bookmarkStart w:id="167" w:name="Xa0971b78a8a348664b4c69706cae37fc055ba55"/>
     <w:p>
       <w:pPr>
         <w:pStyle w:val="Heading2"/>
@@ -29975,8 +31607,8 @@
         </w:pict>
       </w:r>
     </w:p>
-    <w:bookmarkEnd w:id="161"/>
-    <w:bookmarkStart w:id="162" w:name="note-on-sources"/>
+    <w:bookmarkEnd w:id="167"/>
+    <w:bookmarkStart w:id="168" w:name="note-on-sources"/>
     <w:p>
       <w:pPr>
         <w:pStyle w:val="Heading2"/>
@@ -30052,8 +31684,8 @@
         </w:pict>
       </w:r>
     </w:p>
-    <w:bookmarkEnd w:id="162"/>
-    <w:bookmarkStart w:id="163" w:name="final-note-on-research"/>
+    <w:bookmarkEnd w:id="168"/>
+    <w:bookmarkStart w:id="169" w:name="final-note-on-research"/>
     <w:p>
       <w:pPr>
         <w:pStyle w:val="Heading2"/>
@@ -30222,8 +31854,8 @@
         </w:pict>
       </w:r>
     </w:p>
-    <w:bookmarkEnd w:id="163"/>
-    <w:bookmarkStart w:id="164" w:name="about-the-author"/>
+    <w:bookmarkEnd w:id="169"/>
+    <w:bookmarkStart w:id="170" w:name="about-the-author"/>
     <w:p>
       <w:pPr>
         <w:pStyle w:val="Heading2"/>
@@ -30305,8 +31937,8 @@
         </w:pict>
       </w:r>
     </w:p>
-    <w:bookmarkEnd w:id="164"/>
-    <w:bookmarkStart w:id="165" w:name="a-final-word"/>
+    <w:bookmarkEnd w:id="170"/>
+    <w:bookmarkStart w:id="171" w:name="a-final-word"/>
     <w:p>
       <w:pPr>
         <w:pStyle w:val="Heading2"/>
@@ -30388,8 +32020,8 @@
         </w:pict>
       </w:r>
     </w:p>
-    <w:bookmarkEnd w:id="165"/>
-    <w:bookmarkStart w:id="166" w:name="connect-resources"/>
+    <w:bookmarkEnd w:id="171"/>
+    <w:bookmarkStart w:id="172" w:name="connect-resources"/>
     <w:p>
       <w:pPr>
         <w:pStyle w:val="Heading2"/>
@@ -30423,8 +32055,8 @@
         </w:pict>
       </w:r>
     </w:p>
-    <w:bookmarkEnd w:id="166"/>
-    <w:bookmarkStart w:id="167" w:name="recommended-resources"/>
+    <w:bookmarkEnd w:id="172"/>
+    <w:bookmarkStart w:id="173" w:name="recommended-resources"/>
     <w:p>
       <w:pPr>
         <w:pStyle w:val="Heading2"/>
@@ -30498,9 +32130,9 @@
         </w:pict>
       </w:r>
     </w:p>
-    <w:bookmarkEnd w:id="167"/>
-    <w:bookmarkEnd w:id="168"/>
-    <w:bookmarkStart w:id="191" w:name="appendix-b-about-the-cepher-translation"/>
+    <w:bookmarkEnd w:id="173"/>
+    <w:bookmarkEnd w:id="174"/>
+    <w:bookmarkStart w:id="197" w:name="appendix-b-about-the-cepher-translation"/>
     <w:p>
       <w:pPr>
         <w:pStyle w:val="Heading1"/>
@@ -30509,7 +32141,7 @@
         <w:t xml:space="preserve">APPENDIX B: ABOUT THE CEPHER TRANSLATION</w:t>
       </w:r>
     </w:p>
-    <w:bookmarkStart w:id="169" w:name="why-this-book-uses-the-cepher"/>
+    <w:bookmarkStart w:id="175" w:name="why-this-book-uses-the-cepher"/>
     <w:p>
       <w:pPr>
         <w:pStyle w:val="Heading2"/>
@@ -30559,8 +32191,8 @@
         </w:pict>
       </w:r>
     </w:p>
-    <w:bookmarkEnd w:id="169"/>
-    <w:bookmarkStart w:id="173" w:name="the-restoration-of-set-apart-names"/>
+    <w:bookmarkEnd w:id="175"/>
+    <w:bookmarkStart w:id="179" w:name="the-restoration-of-set-apart-names"/>
     <w:p>
       <w:pPr>
         <w:pStyle w:val="Heading2"/>
@@ -30569,7 +32201,7 @@
         <w:t xml:space="preserve">The Restoration of Set-Apart Names</w:t>
       </w:r>
     </w:p>
-    <w:bookmarkStart w:id="170" w:name="the-name-of-the-father-yahuah"/>
+    <w:bookmarkStart w:id="176" w:name="the-name-of-the-father-yahuah"/>
     <w:p>
       <w:pPr>
         <w:pStyle w:val="Heading3"/>
@@ -30783,8 +32415,8 @@
         <w:t xml:space="preserve">45 times in the Tanakh.</w:t>
       </w:r>
     </w:p>
-    <w:bookmarkEnd w:id="170"/>
-    <w:bookmarkStart w:id="171" w:name="the-name-of-the-son-yahusha"/>
+    <w:bookmarkEnd w:id="176"/>
+    <w:bookmarkStart w:id="177" w:name="the-name-of-the-son-yahusha"/>
     <w:p>
       <w:pPr>
         <w:pStyle w:val="Heading3"/>
@@ -31033,8 +32665,8 @@
         <w:t xml:space="preserve">”</w:t>
       </w:r>
     </w:p>
-    <w:bookmarkEnd w:id="171"/>
-    <w:bookmarkStart w:id="172" w:name="the-name-god-and-elohiym"/>
+    <w:bookmarkEnd w:id="177"/>
+    <w:bookmarkStart w:id="178" w:name="the-name-god-and-elohiym"/>
     <w:p>
       <w:pPr>
         <w:pStyle w:val="Heading3"/>
@@ -31259,9 +32891,9 @@
         </w:pict>
       </w:r>
     </w:p>
-    <w:bookmarkEnd w:id="172"/>
-    <w:bookmarkEnd w:id="173"/>
-    <w:bookmarkStart w:id="174" w:name="the-use-of-ruach-instead-of-spirit"/>
+    <w:bookmarkEnd w:id="178"/>
+    <w:bookmarkEnd w:id="179"/>
+    <w:bookmarkStart w:id="180" w:name="the-use-of-ruach-instead-of-spirit"/>
     <w:p>
       <w:pPr>
         <w:pStyle w:val="Heading2"/>
@@ -31571,8 +33203,8 @@
         </w:pict>
       </w:r>
     </w:p>
-    <w:bookmarkEnd w:id="174"/>
-    <w:bookmarkStart w:id="175" w:name="the-word-lucifer-does-not-exist"/>
+    <w:bookmarkEnd w:id="180"/>
+    <w:bookmarkStart w:id="181" w:name="the-word-lucifer-does-not-exist"/>
     <w:p>
       <w:pPr>
         <w:pStyle w:val="Heading2"/>
@@ -31766,8 +33398,8 @@
         </w:pict>
       </w:r>
     </w:p>
-    <w:bookmarkEnd w:id="175"/>
-    <w:bookmarkStart w:id="178" w:name="the-books-that-were-removed"/>
+    <w:bookmarkEnd w:id="181"/>
+    <w:bookmarkStart w:id="184" w:name="the-books-that-were-removed"/>
     <w:p>
       <w:pPr>
         <w:pStyle w:val="Heading2"/>
@@ -31776,7 +33408,7 @@
         <w:t xml:space="preserve">The Books That Were Removed</w:t>
       </w:r>
     </w:p>
-    <w:bookmarkStart w:id="176" w:name="the-dead-sea-scrolls-and-missing-texts"/>
+    <w:bookmarkStart w:id="182" w:name="the-dead-sea-scrolls-and-missing-texts"/>
     <w:p>
       <w:pPr>
         <w:pStyle w:val="Heading3"/>
@@ -31881,8 +33513,8 @@
         <w:t xml:space="preserve">The sixty-six-book reduction was the result of the Westminster Confession, where Parliament reversed itself to give favor to Scottish Presbyterians. The reduction of the text of scripture was exclusively an Anglican political act, not a theological conclusion consistent with the development of scripture.</w:t>
       </w:r>
     </w:p>
-    <w:bookmarkEnd w:id="176"/>
-    <w:bookmarkStart w:id="177" w:name="the-canon-history"/>
+    <w:bookmarkEnd w:id="182"/>
+    <w:bookmarkStart w:id="183" w:name="the-canon-history"/>
     <w:p>
       <w:pPr>
         <w:pStyle w:val="Heading3"/>
@@ -31938,9 +33570,9 @@
         </w:pict>
       </w:r>
     </w:p>
-    <w:bookmarkEnd w:id="177"/>
-    <w:bookmarkEnd w:id="178"/>
-    <w:bookmarkStart w:id="179" w:name="chanoch-enoch-and-its-importance"/>
+    <w:bookmarkEnd w:id="183"/>
+    <w:bookmarkEnd w:id="184"/>
+    <w:bookmarkStart w:id="185" w:name="chanoch-enoch-and-its-importance"/>
     <w:p>
       <w:pPr>
         <w:pStyle w:val="Heading2"/>
@@ -32078,8 +33710,8 @@
         </w:pict>
       </w:r>
     </w:p>
-    <w:bookmarkEnd w:id="179"/>
-    <w:bookmarkStart w:id="182" w:name="yovheliym-jubilees-and-yashar-jasher"/>
+    <w:bookmarkEnd w:id="185"/>
+    <w:bookmarkStart w:id="188" w:name="yovheliym-jubilees-and-yashar-jasher"/>
     <w:p>
       <w:pPr>
         <w:pStyle w:val="Heading2"/>
@@ -32088,7 +33720,7 @@
         <w:t xml:space="preserve">Yovheliym (Jubilees) and Yashar (Jasher)</w:t>
       </w:r>
     </w:p>
-    <w:bookmarkStart w:id="180" w:name="yovheliym-jubilees"/>
+    <w:bookmarkStart w:id="186" w:name="yovheliym-jubilees"/>
     <w:p>
       <w:pPr>
         <w:pStyle w:val="Heading3"/>
@@ -32190,8 +33822,8 @@
         <w:t xml:space="preserve">, into which all of time has been divided.</w:t>
       </w:r>
     </w:p>
-    <w:bookmarkEnd w:id="180"/>
-    <w:bookmarkStart w:id="181" w:name="yashar-jasher"/>
+    <w:bookmarkEnd w:id="186"/>
+    <w:bookmarkStart w:id="187" w:name="yashar-jasher"/>
     <w:p>
       <w:pPr>
         <w:pStyle w:val="Heading3"/>
@@ -32332,9 +33964,9 @@
         </w:pict>
       </w:r>
     </w:p>
-    <w:bookmarkEnd w:id="181"/>
-    <w:bookmarkEnd w:id="182"/>
-    <w:bookmarkStart w:id="187" w:name="X514b60f9f84f0e75dcb1c6f507b0f404338706d"/>
+    <w:bookmarkEnd w:id="187"/>
+    <w:bookmarkEnd w:id="188"/>
+    <w:bookmarkStart w:id="193" w:name="X514b60f9f84f0e75dcb1c6f507b0f404338706d"/>
     <w:p>
       <w:pPr>
         <w:pStyle w:val="Heading2"/>
@@ -32343,7 +33975,7 @@
         <w:t xml:space="preserve">Key Corrections in the Brit Chadashah (New Testament)</w:t>
       </w:r>
     </w:p>
-    <w:bookmarkStart w:id="183" w:name="the-aleph-tav"/>
+    <w:bookmarkStart w:id="189" w:name="the-aleph-tav"/>
     <w:p>
       <w:pPr>
         <w:pStyle w:val="Heading3"/>
@@ -32474,8 +34106,8 @@
         <w:t xml:space="preserve">- Chazon (Revelation) 1:8</w:t>
       </w:r>
     </w:p>
-    <w:bookmarkEnd w:id="183"/>
-    <w:bookmarkStart w:id="184" w:name="the-correction-of-666"/>
+    <w:bookmarkEnd w:id="189"/>
+    <w:bookmarkStart w:id="190" w:name="the-correction-of-666"/>
     <w:p>
       <w:pPr>
         <w:pStyle w:val="Heading3"/>
@@ -32550,8 +34182,8 @@
         <w:t xml:space="preserve">However, there are no numbers in the Greek text - rather three Greek letters: chi xi stigma. These letters found in Strong’s Greek Dictionary 5516 are defined as the 22nd, 14th, and an obsolete letter (4742) of the Greek alphabet, used as numbers denoting 600, 60, and 6. Stigma, Strong’s Greek Dictionary 4742, is a word from a primary stizo meaning a mark incised or punched (for recognition of ownership) - a scar of service, or mark. The Cepher elects to restore the actual picture of the mark as it was seen by Yochanon.</w:t>
       </w:r>
     </w:p>
-    <w:bookmarkEnd w:id="184"/>
-    <w:bookmarkStart w:id="185" w:name="yasharel-israel"/>
+    <w:bookmarkEnd w:id="190"/>
+    <w:bookmarkStart w:id="191" w:name="yasharel-israel"/>
     <w:p>
       <w:pPr>
         <w:pStyle w:val="Heading3"/>
@@ -32668,8 +34300,8 @@
         <w:t xml:space="preserve">All words with this spelling in the Ivriyt have been restored to this spelling in the English.</w:t>
       </w:r>
     </w:p>
-    <w:bookmarkEnd w:id="185"/>
-    <w:bookmarkStart w:id="186" w:name="shaul-and-paal"/>
+    <w:bookmarkEnd w:id="191"/>
+    <w:bookmarkStart w:id="192" w:name="shaul-and-paal"/>
     <w:p>
       <w:pPr>
         <w:pStyle w:val="Heading3"/>
@@ -32727,9 +34359,9 @@
         </w:pict>
       </w:r>
     </w:p>
-    <w:bookmarkEnd w:id="186"/>
-    <w:bookmarkEnd w:id="187"/>
-    <w:bookmarkStart w:id="188" w:name="the-prayer-of-the-cepher"/>
+    <w:bookmarkEnd w:id="192"/>
+    <w:bookmarkEnd w:id="193"/>
+    <w:bookmarkStart w:id="194" w:name="the-prayer-of-the-cepher"/>
     <w:p>
       <w:pPr>
         <w:pStyle w:val="Heading2"/>
@@ -32855,8 +34487,8 @@
         </w:pict>
       </w:r>
     </w:p>
-    <w:bookmarkEnd w:id="188"/>
-    <w:bookmarkStart w:id="189" w:name="connect-with-the-community"/>
+    <w:bookmarkEnd w:id="194"/>
+    <w:bookmarkStart w:id="195" w:name="connect-with-the-community"/>
     <w:p>
       <w:pPr>
         <w:pStyle w:val="Heading2"/>
@@ -32964,8 +34596,8 @@
         </w:pict>
       </w:r>
     </w:p>
-    <w:bookmarkEnd w:id="189"/>
-    <w:bookmarkStart w:id="190" w:name="coming-soon"/>
+    <w:bookmarkEnd w:id="195"/>
+    <w:bookmarkStart w:id="196" w:name="coming-soon"/>
     <w:p>
       <w:pPr>
         <w:pStyle w:val="Heading2"/>
@@ -33118,8 +34750,8 @@
         <w:t xml:space="preserve">https://dwsc.io</w:t>
       </w:r>
     </w:p>
-    <w:bookmarkEnd w:id="190"/>
-    <w:bookmarkEnd w:id="191"/>
+    <w:bookmarkEnd w:id="196"/>
+    <w:bookmarkEnd w:id="197"/>
     <w:sectPr/>
   </w:body>
 </w:document>

</xml_diff>